<commit_message>
feat: completed Version A insecure baseline prototype for dissertation comparison
</commit_message>
<xml_diff>
--- a/Project Progress/Check Mark.docx
+++ b/Project Progress/Check Mark.docx
@@ -107,23 +107,7 @@
         </w:numPr>
       </w:pPr>
       <w:r>
-        <w:t xml:space="preserve">[x] Session Manager: Configuration of </w:t>
-      </w:r>
-      <w:proofErr w:type="spellStart"/>
-      <w:r>
-        <w:t>HttpOnly</w:t>
-      </w:r>
-      <w:proofErr w:type="spellEnd"/>
-      <w:r>
-        <w:t xml:space="preserve">, Secure, and </w:t>
-      </w:r>
-      <w:proofErr w:type="spellStart"/>
-      <w:r>
-        <w:t>SameSite</w:t>
-      </w:r>
-      <w:proofErr w:type="spellEnd"/>
-      <w:r>
-        <w:t xml:space="preserve"> variables. </w:t>
+        <w:t xml:space="preserve">[x] Session Manager: Configuration of HttpOnly, Secure, and SameSite variables. </w:t>
       </w:r>
     </w:p>
     <w:p>
@@ -178,13 +162,8 @@
           <w:numId w:val="2"/>
         </w:numPr>
       </w:pPr>
-      <w:proofErr w:type="gramStart"/>
-      <w:r>
-        <w:t>[ ]</w:t>
-      </w:r>
-      <w:proofErr w:type="gramEnd"/>
-      <w:r>
-        <w:t xml:space="preserve"> B. CMS Application Components (The Prototype Built ON the Framework): Blog Management, Categories, User Management, Dashboards. </w:t>
+      <w:r>
+        <w:t xml:space="preserve">[ ] B. CMS Application Components (The Prototype Built ON the Framework): Blog Management, Categories, User Management, Dashboards. </w:t>
       </w:r>
     </w:p>
     <w:p>
@@ -229,15 +208,7 @@
         </w:numPr>
       </w:pPr>
       <w:r>
-        <w:t>[x] No Public Raw Methods: No public function query($</w:t>
-      </w:r>
-      <w:proofErr w:type="spellStart"/>
-      <w:r>
-        <w:t>sql</w:t>
-      </w:r>
-      <w:proofErr w:type="spellEnd"/>
-      <w:r>
-        <w:t xml:space="preserve">) exposed to the developer. </w:t>
+        <w:t xml:space="preserve">[x] No Public Raw Methods: No public function query($sql) exposed to the developer. </w:t>
       </w:r>
     </w:p>
     <w:p>
@@ -281,14 +252,15 @@
           <w:numId w:val="4"/>
         </w:numPr>
       </w:pPr>
-      <w:proofErr w:type="gramStart"/>
       <w:r>
         <w:lastRenderedPageBreak/>
-        <w:t>[ ]</w:t>
-      </w:r>
-      <w:proofErr w:type="gramEnd"/>
-      <w:r>
-        <w:t xml:space="preserve"> Version A (Baseline - Traditional PHP) construction. </w:t>
+        <w:t>[</w:t>
+      </w:r>
+      <w:r>
+        <w:t>x</w:t>
+      </w:r>
+      <w:r>
+        <w:t xml:space="preserve">] Version A (Baseline - Traditional PHP) construction. </w:t>
       </w:r>
     </w:p>
     <w:p>
@@ -298,13 +270,8 @@
           <w:numId w:val="4"/>
         </w:numPr>
       </w:pPr>
-      <w:proofErr w:type="gramStart"/>
-      <w:r>
-        <w:t>[ ]</w:t>
-      </w:r>
-      <w:proofErr w:type="gramEnd"/>
-      <w:r>
-        <w:t xml:space="preserve"> Version B (Secure-by-Design) construction. </w:t>
+      <w:r>
+        <w:t xml:space="preserve">[ ] Version B (Secure-by-Design) construction. </w:t>
       </w:r>
     </w:p>
     <w:p>
@@ -573,15 +540,7 @@
         </w:numPr>
       </w:pPr>
       <w:r>
-        <w:t xml:space="preserve">[x] Milestone 2: Security Engine: Global </w:t>
-      </w:r>
-      <w:proofErr w:type="spellStart"/>
-      <w:r>
-        <w:t>Middlewares</w:t>
-      </w:r>
-      <w:proofErr w:type="spellEnd"/>
-      <w:r>
-        <w:t xml:space="preserve"> (Context-Aware XSS Template Engine, CSRF, Security Headers, Rate Limiting). </w:t>
+        <w:t xml:space="preserve">[x] Milestone 2: Security Engine: Global Middlewares (Context-Aware XSS Template Engine, CSRF, Security Headers, Rate Limiting). </w:t>
       </w:r>
     </w:p>
     <w:p>
@@ -602,13 +561,14 @@
           <w:numId w:val="8"/>
         </w:numPr>
       </w:pPr>
-      <w:proofErr w:type="gramStart"/>
-      <w:r>
-        <w:t>[ ]</w:t>
-      </w:r>
-      <w:proofErr w:type="gramEnd"/>
-      <w:r>
-        <w:t xml:space="preserve"> Milestone 4: Prototype Construction: Building Version A (Baseline) and Version B (Secure CMS). </w:t>
+      <w:r>
+        <w:t>[</w:t>
+      </w:r>
+      <w:r>
+        <w:t>x</w:t>
+      </w:r>
+      <w:r>
+        <w:t xml:space="preserve">] Milestone 4: Prototype Construction: Building Version A (Baseline) and Version B (Secure CMS). </w:t>
       </w:r>
     </w:p>
     <w:p>
@@ -618,13 +578,8 @@
           <w:numId w:val="8"/>
         </w:numPr>
       </w:pPr>
-      <w:proofErr w:type="gramStart"/>
-      <w:r>
-        <w:t>[ ]</w:t>
-      </w:r>
-      <w:proofErr w:type="gramEnd"/>
-      <w:r>
-        <w:t xml:space="preserve"> Milestone 5: Security Testing: OWASP ZAP DAST scanning and Manual Penetration Testing. </w:t>
+      <w:r>
+        <w:t xml:space="preserve">[ ] Milestone 5: Security Testing: OWASP ZAP DAST scanning and Manual Penetration Testing. </w:t>
       </w:r>
     </w:p>
     <w:p>
@@ -634,13 +589,8 @@
           <w:numId w:val="8"/>
         </w:numPr>
       </w:pPr>
-      <w:proofErr w:type="gramStart"/>
-      <w:r>
-        <w:t>[ ]</w:t>
-      </w:r>
-      <w:proofErr w:type="gramEnd"/>
-      <w:r>
-        <w:t xml:space="preserve"> Milestone 6: Final Handoff: Code delivery, evidence compilation, and documentation. </w:t>
+      <w:r>
+        <w:t xml:space="preserve">[ ] Milestone 6: Final Handoff: Code delivery, evidence compilation, and documentation. </w:t>
       </w:r>
     </w:p>
     <w:p>
@@ -673,13 +623,8 @@
           <w:numId w:val="9"/>
         </w:numPr>
       </w:pPr>
-      <w:proofErr w:type="gramStart"/>
-      <w:r>
-        <w:t>[ ]</w:t>
-      </w:r>
-      <w:proofErr w:type="gramEnd"/>
-      <w:r>
-        <w:t xml:space="preserve"> OWASP ZAP Scan Reports. </w:t>
+      <w:r>
+        <w:t xml:space="preserve">[ ] OWASP ZAP Scan Reports. </w:t>
       </w:r>
     </w:p>
     <w:p>
@@ -689,13 +634,8 @@
           <w:numId w:val="9"/>
         </w:numPr>
       </w:pPr>
-      <w:proofErr w:type="gramStart"/>
-      <w:r>
-        <w:t>[ ]</w:t>
-      </w:r>
-      <w:proofErr w:type="gramEnd"/>
-      <w:r>
-        <w:t xml:space="preserve"> Manual Testing Logs. </w:t>
+      <w:r>
+        <w:t xml:space="preserve">[ ] Manual Testing Logs. </w:t>
       </w:r>
     </w:p>
     <w:p>
@@ -705,13 +645,8 @@
           <w:numId w:val="9"/>
         </w:numPr>
       </w:pPr>
-      <w:proofErr w:type="gramStart"/>
-      <w:r>
-        <w:t>[ ]</w:t>
-      </w:r>
-      <w:proofErr w:type="gramEnd"/>
-      <w:r>
-        <w:t xml:space="preserve"> Security Improvement Comparison Report. </w:t>
+      <w:r>
+        <w:t xml:space="preserve">[ ] Security Improvement Comparison Report. </w:t>
       </w:r>
     </w:p>
     <w:p>
@@ -766,13 +701,8 @@
           <w:numId w:val="10"/>
         </w:numPr>
       </w:pPr>
-      <w:proofErr w:type="gramStart"/>
-      <w:r>
-        <w:t>[ ]</w:t>
-      </w:r>
-      <w:proofErr w:type="gramEnd"/>
-      <w:r>
-        <w:t xml:space="preserve"> STRIDE Threat Model &amp; Attack Surface Analysis Table. </w:t>
+      <w:r>
+        <w:t xml:space="preserve">[ ] STRIDE Threat Model &amp; Attack Surface Analysis Table. </w:t>
       </w:r>
     </w:p>
     <w:p>
@@ -782,13 +712,14 @@
           <w:numId w:val="10"/>
         </w:numPr>
       </w:pPr>
-      <w:proofErr w:type="gramStart"/>
-      <w:r>
-        <w:t>[ ]</w:t>
-      </w:r>
-      <w:proofErr w:type="gramEnd"/>
-      <w:r>
-        <w:t xml:space="preserve"> Before/After Screenshots. </w:t>
+      <w:r>
+        <w:t>[</w:t>
+      </w:r>
+      <w:r>
+        <w:t>x</w:t>
+      </w:r>
+      <w:r>
+        <w:t xml:space="preserve">] Before/After Screenshots. </w:t>
       </w:r>
     </w:p>
     <w:p>
@@ -798,13 +729,8 @@
           <w:numId w:val="10"/>
         </w:numPr>
       </w:pPr>
-      <w:proofErr w:type="gramStart"/>
-      <w:r>
-        <w:t>[ ]</w:t>
-      </w:r>
-      <w:proofErr w:type="gramEnd"/>
-      <w:r>
-        <w:t xml:space="preserve"> Raw Audit Logs catching penetration testing attempts. </w:t>
+      <w:r>
+        <w:t xml:space="preserve">[ ] Raw Audit Logs catching penetration testing attempts. </w:t>
       </w:r>
     </w:p>
     <w:p>
@@ -814,13 +740,8 @@
           <w:numId w:val="10"/>
         </w:numPr>
       </w:pPr>
-      <w:proofErr w:type="gramStart"/>
-      <w:r>
-        <w:t>[ ]</w:t>
-      </w:r>
-      <w:proofErr w:type="gramEnd"/>
-      <w:r>
-        <w:t xml:space="preserve"> Comparative Vulnerability Tables. </w:t>
+      <w:r>
+        <w:t xml:space="preserve">[ ] Comparative Vulnerability Tables. </w:t>
       </w:r>
     </w:p>
     <w:p/>
@@ -2962,6 +2883,7 @@
   <w:style w:type="character" w:default="1" w:styleId="DefaultParagraphFont">
     <w:name w:val="Default Paragraph Font"/>
     <w:uiPriority w:val="1"/>
+    <w:semiHidden/>
     <w:unhideWhenUsed/>
   </w:style>
   <w:style w:type="table" w:default="1" w:styleId="TableNormal">

</xml_diff>

<commit_message>
feat: implement secure blog controller, dashboard routing, and verify Stored XSS mitigation
</commit_message>
<xml_diff>
--- a/Project Progress/Check Mark.docx
+++ b/Project Progress/Check Mark.docx
@@ -107,7 +107,23 @@
         </w:numPr>
       </w:pPr>
       <w:r>
-        <w:t xml:space="preserve">[x] Session Manager: Configuration of HttpOnly, Secure, and SameSite variables. </w:t>
+        <w:t xml:space="preserve">[x] Session Manager: Configuration of </w:t>
+      </w:r>
+      <w:proofErr w:type="spellStart"/>
+      <w:r>
+        <w:t>HttpOnly</w:t>
+      </w:r>
+      <w:proofErr w:type="spellEnd"/>
+      <w:r>
+        <w:t xml:space="preserve">, Secure, and </w:t>
+      </w:r>
+      <w:proofErr w:type="spellStart"/>
+      <w:r>
+        <w:t>SameSite</w:t>
+      </w:r>
+      <w:proofErr w:type="spellEnd"/>
+      <w:r>
+        <w:t xml:space="preserve"> variables. </w:t>
       </w:r>
     </w:p>
     <w:p>
@@ -163,7 +179,13 @@
         </w:numPr>
       </w:pPr>
       <w:r>
-        <w:t xml:space="preserve">[ ] B. CMS Application Components (The Prototype Built ON the Framework): Blog Management, Categories, User Management, Dashboards. </w:t>
+        <w:t>[</w:t>
+      </w:r>
+      <w:r>
+        <w:t>x</w:t>
+      </w:r>
+      <w:r>
+        <w:t xml:space="preserve">] B. CMS Application Components (The Prototype Built ON the Framework): Blog Management, Categories, User Management, Dashboards. </w:t>
       </w:r>
     </w:p>
     <w:p>
@@ -208,7 +230,15 @@
         </w:numPr>
       </w:pPr>
       <w:r>
-        <w:t xml:space="preserve">[x] No Public Raw Methods: No public function query($sql) exposed to the developer. </w:t>
+        <w:t>[x] No Public Raw Methods: No public function query($</w:t>
+      </w:r>
+      <w:proofErr w:type="spellStart"/>
+      <w:r>
+        <w:t>sql</w:t>
+      </w:r>
+      <w:proofErr w:type="spellEnd"/>
+      <w:r>
+        <w:t xml:space="preserve">) exposed to the developer. </w:t>
       </w:r>
     </w:p>
     <w:p>
@@ -271,7 +301,13 @@
         </w:numPr>
       </w:pPr>
       <w:r>
-        <w:t xml:space="preserve">[ ] Version B (Secure-by-Design) construction. </w:t>
+        <w:t>[</w:t>
+      </w:r>
+      <w:r>
+        <w:t>x</w:t>
+      </w:r>
+      <w:r>
+        <w:t xml:space="preserve">] Version B (Secure-by-Design) construction. </w:t>
       </w:r>
     </w:p>
     <w:p>
@@ -540,7 +576,15 @@
         </w:numPr>
       </w:pPr>
       <w:r>
-        <w:t xml:space="preserve">[x] Milestone 2: Security Engine: Global Middlewares (Context-Aware XSS Template Engine, CSRF, Security Headers, Rate Limiting). </w:t>
+        <w:t xml:space="preserve">[x] Milestone 2: Security Engine: Global </w:t>
+      </w:r>
+      <w:proofErr w:type="spellStart"/>
+      <w:r>
+        <w:t>Middlewares</w:t>
+      </w:r>
+      <w:proofErr w:type="spellEnd"/>
+      <w:r>
+        <w:t xml:space="preserve"> (Context-Aware XSS Template Engine, CSRF, Security Headers, Rate Limiting). </w:t>
       </w:r>
     </w:p>
     <w:p>
@@ -579,7 +623,13 @@
         </w:numPr>
       </w:pPr>
       <w:r>
-        <w:t xml:space="preserve">[ ] Milestone 5: Security Testing: OWASP ZAP DAST scanning and Manual Penetration Testing. </w:t>
+        <w:t>[</w:t>
+      </w:r>
+      <w:r>
+        <w:t>-</w:t>
+      </w:r>
+      <w:r>
+        <w:t xml:space="preserve">] Milestone 5: Security Testing: OWASP ZAP DAST scanning and Manual Penetration Testing. </w:t>
       </w:r>
     </w:p>
     <w:p>
@@ -635,7 +685,13 @@
         </w:numPr>
       </w:pPr>
       <w:r>
-        <w:t xml:space="preserve">[ ] Manual Testing Logs. </w:t>
+        <w:t>[</w:t>
+      </w:r>
+      <w:r>
+        <w:t>-</w:t>
+      </w:r>
+      <w:r>
+        <w:t xml:space="preserve">] Manual Testing Logs. </w:t>
       </w:r>
     </w:p>
     <w:p>

</xml_diff>

<commit_message>
feat: finalize Secure-by-Design framework, Baseline App, and security testing logs
</commit_message>
<xml_diff>
--- a/Project Progress/Check Mark.docx
+++ b/Project Progress/Check Mark.docx
@@ -107,23 +107,7 @@
         </w:numPr>
       </w:pPr>
       <w:r>
-        <w:t xml:space="preserve">[x] Session Manager: Configuration of </w:t>
-      </w:r>
-      <w:proofErr w:type="spellStart"/>
-      <w:r>
-        <w:t>HttpOnly</w:t>
-      </w:r>
-      <w:proofErr w:type="spellEnd"/>
-      <w:r>
-        <w:t xml:space="preserve">, Secure, and </w:t>
-      </w:r>
-      <w:proofErr w:type="spellStart"/>
-      <w:r>
-        <w:t>SameSite</w:t>
-      </w:r>
-      <w:proofErr w:type="spellEnd"/>
-      <w:r>
-        <w:t xml:space="preserve"> variables. </w:t>
+        <w:t xml:space="preserve">[x] Session Manager: Configuration of HttpOnly, Secure, and SameSite variables. </w:t>
       </w:r>
     </w:p>
     <w:p>
@@ -230,15 +214,7 @@
         </w:numPr>
       </w:pPr>
       <w:r>
-        <w:t>[x] No Public Raw Methods: No public function query($</w:t>
-      </w:r>
-      <w:proofErr w:type="spellStart"/>
-      <w:r>
-        <w:t>sql</w:t>
-      </w:r>
-      <w:proofErr w:type="spellEnd"/>
-      <w:r>
-        <w:t xml:space="preserve">) exposed to the developer. </w:t>
+        <w:t xml:space="preserve">[x] No Public Raw Methods: No public function query($sql) exposed to the developer. </w:t>
       </w:r>
     </w:p>
     <w:p>
@@ -576,15 +552,7 @@
         </w:numPr>
       </w:pPr>
       <w:r>
-        <w:t xml:space="preserve">[x] Milestone 2: Security Engine: Global </w:t>
-      </w:r>
-      <w:proofErr w:type="spellStart"/>
-      <w:r>
-        <w:t>Middlewares</w:t>
-      </w:r>
-      <w:proofErr w:type="spellEnd"/>
-      <w:r>
-        <w:t xml:space="preserve"> (Context-Aware XSS Template Engine, CSRF, Security Headers, Rate Limiting). </w:t>
+        <w:t xml:space="preserve">[x] Milestone 2: Security Engine: Global Middlewares (Context-Aware XSS Template Engine, CSRF, Security Headers, Rate Limiting). </w:t>
       </w:r>
     </w:p>
     <w:p>
@@ -626,21 +594,27 @@
         <w:t>[</w:t>
       </w:r>
       <w:r>
+        <w:t>x</w:t>
+      </w:r>
+      <w:r>
+        <w:t xml:space="preserve">] Milestone 5: Security Testing: OWASP ZAP DAST scanning and Manual Penetration Testing. </w:t>
+      </w:r>
+    </w:p>
+    <w:p>
+      <w:pPr>
+        <w:numPr>
+          <w:ilvl w:val="0"/>
+          <w:numId w:val="8"/>
+        </w:numPr>
+      </w:pPr>
+      <w:r>
+        <w:t>[</w:t>
+      </w:r>
+      <w:r>
         <w:t>-</w:t>
       </w:r>
       <w:r>
-        <w:t xml:space="preserve">] Milestone 5: Security Testing: OWASP ZAP DAST scanning and Manual Penetration Testing. </w:t>
-      </w:r>
-    </w:p>
-    <w:p>
-      <w:pPr>
-        <w:numPr>
-          <w:ilvl w:val="0"/>
-          <w:numId w:val="8"/>
-        </w:numPr>
-      </w:pPr>
-      <w:r>
-        <w:t xml:space="preserve">[ ] Milestone 6: Final Handoff: Code delivery, evidence compilation, and documentation. </w:t>
+        <w:t xml:space="preserve">] Milestone 6: Final Handoff: Code delivery, evidence compilation, and documentation. </w:t>
       </w:r>
     </w:p>
     <w:p>
@@ -674,7 +648,13 @@
         </w:numPr>
       </w:pPr>
       <w:r>
-        <w:t xml:space="preserve">[ ] OWASP ZAP Scan Reports. </w:t>
+        <w:t>[</w:t>
+      </w:r>
+      <w:r>
+        <w:t>x</w:t>
+      </w:r>
+      <w:r>
+        <w:t xml:space="preserve">] OWASP ZAP Scan Reports. </w:t>
       </w:r>
     </w:p>
     <w:p>
@@ -688,21 +668,27 @@
         <w:t>[</w:t>
       </w:r>
       <w:r>
+        <w:t>x</w:t>
+      </w:r>
+      <w:r>
+        <w:t xml:space="preserve">] Manual Testing Logs. </w:t>
+      </w:r>
+    </w:p>
+    <w:p>
+      <w:pPr>
+        <w:numPr>
+          <w:ilvl w:val="0"/>
+          <w:numId w:val="9"/>
+        </w:numPr>
+      </w:pPr>
+      <w:r>
+        <w:t>[</w:t>
+      </w:r>
+      <w:r>
         <w:t>-</w:t>
       </w:r>
       <w:r>
-        <w:t xml:space="preserve">] Manual Testing Logs. </w:t>
-      </w:r>
-    </w:p>
-    <w:p>
-      <w:pPr>
-        <w:numPr>
-          <w:ilvl w:val="0"/>
-          <w:numId w:val="9"/>
-        </w:numPr>
-      </w:pPr>
-      <w:r>
-        <w:t xml:space="preserve">[ ] Security Improvement Comparison Report. </w:t>
+        <w:t xml:space="preserve">] Security Improvement Comparison Report. </w:t>
       </w:r>
     </w:p>
     <w:p>
@@ -758,7 +744,13 @@
         </w:numPr>
       </w:pPr>
       <w:r>
-        <w:t xml:space="preserve">[ ] STRIDE Threat Model &amp; Attack Surface Analysis Table. </w:t>
+        <w:t>[</w:t>
+      </w:r>
+      <w:r>
+        <w:t>x</w:t>
+      </w:r>
+      <w:r>
+        <w:t xml:space="preserve">] STRIDE Threat Model &amp; Attack Surface Analysis Table. </w:t>
       </w:r>
     </w:p>
     <w:p>
@@ -786,7 +778,13 @@
         </w:numPr>
       </w:pPr>
       <w:r>
-        <w:t xml:space="preserve">[ ] Raw Audit Logs catching penetration testing attempts. </w:t>
+        <w:t>[</w:t>
+      </w:r>
+      <w:r>
+        <w:t>x</w:t>
+      </w:r>
+      <w:r>
+        <w:t xml:space="preserve">] Raw Audit Logs catching penetration testing attempts. </w:t>
       </w:r>
     </w:p>
     <w:p>
@@ -797,7 +795,13 @@
         </w:numPr>
       </w:pPr>
       <w:r>
-        <w:t xml:space="preserve">[ ] Comparative Vulnerability Tables. </w:t>
+        <w:t>[</w:t>
+      </w:r>
+      <w:r>
+        <w:t>x</w:t>
+      </w:r>
+      <w:r>
+        <w:t xml:space="preserve">] Comparative Vulnerability Tables. </w:t>
       </w:r>
     </w:p>
     <w:p/>

</xml_diff>

<commit_message>
Integrated Security Audit Logs, Active IP Blocking, XSS Trap, and Dashboard UI
</commit_message>
<xml_diff>
--- a/Project Progress/Check Mark.docx
+++ b/Project Progress/Check Mark.docx
@@ -1,14 +1,8 @@
 
 <file path=word/document.xml><?xml version="1.0" encoding="utf-8"?>
-<w:document xmlns:wpc="http://schemas.microsoft.com/office/word/2010/wordprocessingCanvas" xmlns:cx="http://schemas.microsoft.com/office/drawing/2014/chartex" xmlns:cx1="http://schemas.microsoft.com/office/drawing/2015/9/8/chartex" xmlns:cx2="http://schemas.microsoft.com/office/drawing/2015/10/21/chartex" xmlns:cx3="http://schemas.microsoft.com/office/drawing/2016/5/9/chartex" xmlns:cx4="http://schemas.microsoft.com/office/drawing/2016/5/10/chartex" xmlns:cx5="http://schemas.microsoft.com/office/drawing/2016/5/11/chartex" xmlns:cx6="http://schemas.microsoft.com/office/drawing/2016/5/12/chartex" xmlns:cx7="http://schemas.microsoft.com/office/drawing/2016/5/13/chartex" xmlns:cx8="http://schemas.microsoft.com/office/drawing/2016/5/14/chartex" xmlns:mc="http://schemas.openxmlformats.org/markup-compatibility/2006" xmlns:aink="http://schemas.microsoft.com/office/drawing/2016/ink" xmlns:am3d="http://schemas.microsoft.com/office/drawing/2017/model3d" xmlns:o="urn:schemas-microsoft-com:office:office" xmlns:oel="http://schemas.microsoft.com/office/2019/extlst" xmlns:r="http://schemas.openxmlformats.org/officeDocument/2006/relationships" xmlns:m="http://schemas.openxmlformats.org/officeDocument/2006/math" xmlns:v="urn:schemas-microsoft-com:vml" xmlns:wp14="http://schemas.microsoft.com/office/word/2010/wordprocessingDrawing" xmlns:wp="http://schemas.openxmlformats.org/drawingml/2006/wordprocessingDrawing" xmlns:w10="urn:schemas-microsoft-com:office:word" xmlns:w="http://schemas.openxmlformats.org/wordprocessingml/2006/main" xmlns:w14="http://schemas.microsoft.com/office/word/2010/wordml" xmlns:w15="http://schemas.microsoft.com/office/word/2012/wordml" xmlns:w16cex="http://schemas.microsoft.com/office/word/2018/wordml/cex" xmlns:w16cid="http://schemas.microsoft.com/office/word/2016/wordml/cid" xmlns:w16="http://schemas.microsoft.com/office/word/2018/wordml" xmlns:w16du="http://schemas.microsoft.com/office/word/2023/wordml/word16du" xmlns:w16sdtdh="http://schemas.microsoft.com/office/word/2020/wordml/sdtdatahash" xmlns:w16sdtfl="http://schemas.microsoft.com/office/word/2024/wordml/sdtformatlock" xmlns:w16se="http://schemas.microsoft.com/office/word/2015/wordml/symex" xmlns:wpg="http://schemas.microsoft.com/office/word/2010/wordprocessingGroup" xmlns:wpi="http://schemas.microsoft.com/office/word/2010/wordprocessingInk" xmlns:wne="http://schemas.microsoft.com/office/word/2006/wordml" xmlns:wps="http://schemas.microsoft.com/office/word/2010/wordprocessingShape" mc:Ignorable="w14 w15 w16se w16cid w16 w16cex w16sdtdh w16sdtfl w16du wp14">
+<w:document xmlns:wpc="http://schemas.microsoft.com/office/word/2010/wordprocessingCanvas" xmlns:cx="http://schemas.microsoft.com/office/drawing/2014/chartex" xmlns:cx1="http://schemas.microsoft.com/office/drawing/2015/9/8/chartex" xmlns:cx2="http://schemas.microsoft.com/office/drawing/2015/10/21/chartex" xmlns:cx3="http://schemas.microsoft.com/office/drawing/2016/5/9/chartex" xmlns:cx4="http://schemas.microsoft.com/office/drawing/2016/5/10/chartex" xmlns:cx5="http://schemas.microsoft.com/office/drawing/2016/5/11/chartex" xmlns:cx6="http://schemas.microsoft.com/office/drawing/2016/5/12/chartex" xmlns:cx7="http://schemas.microsoft.com/office/drawing/2016/5/13/chartex" xmlns:cx8="http://schemas.microsoft.com/office/drawing/2016/5/14/chartex" xmlns:mc="http://schemas.openxmlformats.org/markup-compatibility/2006" xmlns:aink="http://schemas.microsoft.com/office/drawing/2016/ink" xmlns:am3d="http://schemas.microsoft.com/office/drawing/2017/model3d" xmlns:o="urn:schemas-microsoft-com:office:office" xmlns:oel="http://schemas.microsoft.com/office/2019/extlst" xmlns:r="http://schemas.openxmlformats.org/officeDocument/2006/relationships" xmlns:m="http://schemas.openxmlformats.org/officeDocument/2006/math" xmlns:v="urn:schemas-microsoft-com:vml" xmlns:wp14="http://schemas.microsoft.com/office/word/2010/wordprocessingDrawing" xmlns:wp="http://schemas.openxmlformats.org/drawingml/2006/wordprocessingDrawing" xmlns:w10="urn:schemas-microsoft-com:office:word" xmlns:w="http://schemas.openxmlformats.org/wordprocessingml/2006/main" xmlns:w14="http://schemas.microsoft.com/office/word/2010/wordml" xmlns:w15="http://schemas.microsoft.com/office/word/2012/wordml" xmlns:w16cei="http://schemas.microsoft.com/office/word/2026/wordml/cei" xmlns:w16cex="http://schemas.microsoft.com/office/word/2018/wordml/cex" xmlns:w16cid="http://schemas.microsoft.com/office/word/2016/wordml/cid" xmlns:w16="http://schemas.microsoft.com/office/word/2018/wordml" xmlns:w16du="http://schemas.microsoft.com/office/word/2023/wordml/word16du" xmlns:w16sdtdh="http://schemas.microsoft.com/office/word/2020/wordml/sdtdatahash" xmlns:w16sdtfl="http://schemas.microsoft.com/office/word/2024/wordml/sdtformatlock" xmlns:w16se="http://schemas.microsoft.com/office/word/2015/wordml/symex" xmlns:wpg="http://schemas.microsoft.com/office/word/2010/wordprocessingGroup" xmlns:wpi="http://schemas.microsoft.com/office/word/2010/wordprocessingInk" xmlns:wne="http://schemas.microsoft.com/office/word/2006/wordml" xmlns:wps="http://schemas.microsoft.com/office/word/2010/wordprocessingShape" mc:Ignorable="w14 w15 w16se w16cid w16 w16cex w16sdtdh w16sdtfl w16du wp14">
   <w:body>
     <w:p>
-      <w:pPr>
-        <w:rPr>
-          <w:b/>
-          <w:bCs/>
-        </w:rPr>
-      </w:pPr>
       <w:r>
         <w:rPr>
           <w:b/>
@@ -18,15 +12,10 @@
       </w:r>
     </w:p>
     <w:p>
-      <w:r>
-        <w:t>Included in Core Framework (Version 1 Scope):</w:t>
-      </w:r>
-    </w:p>
-    <w:p>
       <w:pPr>
         <w:numPr>
           <w:ilvl w:val="0"/>
-          <w:numId w:val="1"/>
+          <w:numId w:val="11"/>
         </w:numPr>
       </w:pPr>
       <w:r>
@@ -37,7 +26,7 @@
       <w:pPr>
         <w:numPr>
           <w:ilvl w:val="0"/>
-          <w:numId w:val="1"/>
+          <w:numId w:val="11"/>
         </w:numPr>
       </w:pPr>
       <w:r>
@@ -48,7 +37,7 @@
       <w:pPr>
         <w:numPr>
           <w:ilvl w:val="0"/>
-          <w:numId w:val="1"/>
+          <w:numId w:val="11"/>
         </w:numPr>
       </w:pPr>
       <w:r>
@@ -59,7 +48,7 @@
       <w:pPr>
         <w:numPr>
           <w:ilvl w:val="0"/>
-          <w:numId w:val="1"/>
+          <w:numId w:val="11"/>
         </w:numPr>
       </w:pPr>
       <w:r>
@@ -70,7 +59,7 @@
       <w:pPr>
         <w:numPr>
           <w:ilvl w:val="0"/>
-          <w:numId w:val="1"/>
+          <w:numId w:val="11"/>
         </w:numPr>
       </w:pPr>
       <w:r>
@@ -81,7 +70,7 @@
       <w:pPr>
         <w:numPr>
           <w:ilvl w:val="0"/>
-          <w:numId w:val="1"/>
+          <w:numId w:val="11"/>
         </w:numPr>
       </w:pPr>
       <w:r>
@@ -92,7 +81,7 @@
       <w:pPr>
         <w:numPr>
           <w:ilvl w:val="0"/>
-          <w:numId w:val="1"/>
+          <w:numId w:val="11"/>
         </w:numPr>
       </w:pPr>
       <w:r>
@@ -103,18 +92,34 @@
       <w:pPr>
         <w:numPr>
           <w:ilvl w:val="0"/>
-          <w:numId w:val="1"/>
+          <w:numId w:val="11"/>
         </w:numPr>
       </w:pPr>
       <w:r>
-        <w:t xml:space="preserve">[x] Session Manager: Configuration of HttpOnly, Secure, and SameSite variables. </w:t>
+        <w:t xml:space="preserve">[x] Session Manager: Configuration of </w:t>
+      </w:r>
+      <w:proofErr w:type="spellStart"/>
+      <w:r>
+        <w:t>HttpOnly</w:t>
+      </w:r>
+      <w:proofErr w:type="spellEnd"/>
+      <w:r>
+        <w:t xml:space="preserve">, Secure, and </w:t>
+      </w:r>
+      <w:proofErr w:type="spellStart"/>
+      <w:r>
+        <w:t>SameSite</w:t>
+      </w:r>
+      <w:proofErr w:type="spellEnd"/>
+      <w:r>
+        <w:t xml:space="preserve"> variables. </w:t>
       </w:r>
     </w:p>
     <w:p>
       <w:pPr>
         <w:numPr>
           <w:ilvl w:val="0"/>
-          <w:numId w:val="1"/>
+          <w:numId w:val="11"/>
         </w:numPr>
       </w:pPr>
       <w:r>
@@ -122,20 +127,6 @@
       </w:r>
     </w:p>
     <w:p>
-      <w:pPr>
-        <w:rPr>
-          <w:b/>
-          <w:bCs/>
-        </w:rPr>
-      </w:pPr>
-    </w:p>
-    <w:p>
-      <w:pPr>
-        <w:rPr>
-          <w:b/>
-          <w:bCs/>
-        </w:rPr>
-      </w:pPr>
       <w:r>
         <w:rPr>
           <w:b/>
@@ -148,7 +139,7 @@
       <w:pPr>
         <w:numPr>
           <w:ilvl w:val="0"/>
-          <w:numId w:val="2"/>
+          <w:numId w:val="12"/>
         </w:numPr>
       </w:pPr>
       <w:r>
@@ -159,34 +150,14 @@
       <w:pPr>
         <w:numPr>
           <w:ilvl w:val="0"/>
-          <w:numId w:val="2"/>
+          <w:numId w:val="12"/>
         </w:numPr>
       </w:pPr>
       <w:r>
-        <w:t>[</w:t>
-      </w:r>
-      <w:r>
-        <w:t>x</w:t>
-      </w:r>
-      <w:r>
-        <w:t xml:space="preserve">] B. CMS Application Components (The Prototype Built ON the Framework): Blog Management, Categories, User Management, Dashboards. </w:t>
-      </w:r>
-    </w:p>
-    <w:p>
-      <w:pPr>
-        <w:rPr>
-          <w:b/>
-          <w:bCs/>
-        </w:rPr>
-      </w:pPr>
-    </w:p>
-    <w:p>
-      <w:pPr>
-        <w:rPr>
-          <w:b/>
-          <w:bCs/>
-        </w:rPr>
-      </w:pPr>
+        <w:t xml:space="preserve">[x] B. CMS Application Components (The Prototype Built ON the Framework): Blog Management, Categories, User Management, Dashboards. </w:t>
+      </w:r>
+    </w:p>
+    <w:p>
       <w:r>
         <w:rPr>
           <w:b/>
@@ -199,7 +170,7 @@
       <w:pPr>
         <w:numPr>
           <w:ilvl w:val="0"/>
-          <w:numId w:val="3"/>
+          <w:numId w:val="13"/>
         </w:numPr>
       </w:pPr>
       <w:r>
@@ -210,18 +181,26 @@
       <w:pPr>
         <w:numPr>
           <w:ilvl w:val="0"/>
-          <w:numId w:val="3"/>
+          <w:numId w:val="13"/>
         </w:numPr>
       </w:pPr>
       <w:r>
-        <w:t xml:space="preserve">[x] No Public Raw Methods: No public function query($sql) exposed to the developer. </w:t>
+        <w:t>[x] No Public Raw Methods: No public function query($</w:t>
+      </w:r>
+      <w:proofErr w:type="spellStart"/>
+      <w:r>
+        <w:t>sql</w:t>
+      </w:r>
+      <w:proofErr w:type="spellEnd"/>
+      <w:r>
+        <w:t xml:space="preserve">) exposed to the developer. </w:t>
       </w:r>
     </w:p>
     <w:p>
       <w:pPr>
         <w:numPr>
           <w:ilvl w:val="0"/>
-          <w:numId w:val="3"/>
+          <w:numId w:val="13"/>
         </w:numPr>
       </w:pPr>
       <w:r>
@@ -229,20 +208,6 @@
       </w:r>
     </w:p>
     <w:p>
-      <w:pPr>
-        <w:rPr>
-          <w:b/>
-          <w:bCs/>
-        </w:rPr>
-      </w:pPr>
-    </w:p>
-    <w:p>
-      <w:pPr>
-        <w:rPr>
-          <w:b/>
-          <w:bCs/>
-        </w:rPr>
-      </w:pPr>
       <w:r>
         <w:rPr>
           <w:b/>
@@ -255,52 +220,25 @@
       <w:pPr>
         <w:numPr>
           <w:ilvl w:val="0"/>
-          <w:numId w:val="4"/>
+          <w:numId w:val="14"/>
         </w:numPr>
       </w:pPr>
       <w:r>
-        <w:lastRenderedPageBreak/>
-        <w:t>[</w:t>
-      </w:r>
-      <w:r>
-        <w:t>x</w:t>
-      </w:r>
-      <w:r>
-        <w:t xml:space="preserve">] Version A (Baseline - Traditional PHP) construction. </w:t>
+        <w:t xml:space="preserve">[x] Version A (Baseline - Traditional PHP) construction. </w:t>
       </w:r>
     </w:p>
     <w:p>
       <w:pPr>
         <w:numPr>
           <w:ilvl w:val="0"/>
-          <w:numId w:val="4"/>
+          <w:numId w:val="14"/>
         </w:numPr>
       </w:pPr>
       <w:r>
-        <w:t>[</w:t>
-      </w:r>
-      <w:r>
-        <w:t>x</w:t>
-      </w:r>
-      <w:r>
-        <w:t xml:space="preserve">] Version B (Secure-by-Design) construction. </w:t>
-      </w:r>
-    </w:p>
-    <w:p>
-      <w:pPr>
-        <w:rPr>
-          <w:b/>
-          <w:bCs/>
-        </w:rPr>
-      </w:pPr>
-    </w:p>
-    <w:p>
-      <w:pPr>
-        <w:rPr>
-          <w:b/>
-          <w:bCs/>
-        </w:rPr>
-      </w:pPr>
+        <w:t xml:space="preserve">[x] Version B (Secure-by-Design) construction. </w:t>
+      </w:r>
+    </w:p>
+    <w:p>
       <w:r>
         <w:rPr>
           <w:b/>
@@ -313,7 +251,7 @@
       <w:pPr>
         <w:numPr>
           <w:ilvl w:val="0"/>
-          <w:numId w:val="5"/>
+          <w:numId w:val="15"/>
         </w:numPr>
       </w:pPr>
       <w:r>
@@ -324,10 +262,11 @@
       <w:pPr>
         <w:numPr>
           <w:ilvl w:val="0"/>
-          <w:numId w:val="5"/>
+          <w:numId w:val="15"/>
         </w:numPr>
       </w:pPr>
       <w:r>
+        <w:lastRenderedPageBreak/>
         <w:t xml:space="preserve">[x] V4 Access Control: Role-Based Access Control route interceptors. </w:t>
       </w:r>
     </w:p>
@@ -335,50 +274,58 @@
       <w:pPr>
         <w:numPr>
           <w:ilvl w:val="0"/>
-          <w:numId w:val="5"/>
+          <w:numId w:val="15"/>
         </w:numPr>
       </w:pPr>
       <w:r>
-        <w:t xml:space="preserve">[x] V5.3 Output Escaping: Automatic context-aware encoding. </w:t>
+        <w:t>[x] V5.1 Input Validation: Dual-layer client-side and server-side validation strictly enforced across CMS submission forms.</w:t>
       </w:r>
     </w:p>
     <w:p>
       <w:pPr>
         <w:numPr>
           <w:ilvl w:val="0"/>
-          <w:numId w:val="5"/>
+          <w:numId w:val="15"/>
         </w:numPr>
       </w:pPr>
       <w:r>
-        <w:t xml:space="preserve">[x] V5.5 Database Security: Pure Prepared Statements; no public raw query exposure. </w:t>
+        <w:t xml:space="preserve">[x] V5.3 Output Escaping: Automatic context-aware encoding. </w:t>
       </w:r>
     </w:p>
     <w:p>
       <w:pPr>
         <w:numPr>
           <w:ilvl w:val="0"/>
-          <w:numId w:val="5"/>
+          <w:numId w:val="15"/>
         </w:numPr>
       </w:pPr>
       <w:r>
+        <w:t xml:space="preserve">[x] V5.5 Database Security: Pure Prepared Statements; no public raw query exposure. </w:t>
+      </w:r>
+    </w:p>
+    <w:p>
+      <w:pPr>
+        <w:numPr>
+          <w:ilvl w:val="0"/>
+          <w:numId w:val="15"/>
+        </w:numPr>
+      </w:pPr>
+      <w:r>
+        <w:t>[x] V7.1 &amp; V11.1 Audit Logging &amp; Active Defense: Real-time network-layer IP blocking and forensic tracking fully operational via the Security Dashboard.</w:t>
+      </w:r>
+    </w:p>
+    <w:p>
+      <w:pPr>
+        <w:numPr>
+          <w:ilvl w:val="0"/>
+          <w:numId w:val="15"/>
+        </w:numPr>
+      </w:pPr>
+      <w:r>
         <w:t xml:space="preserve">[x] V14 Configuration: Auto-injection of CSP, HSTS, X-Frame-Options, X-Content-Type-Options. </w:t>
       </w:r>
     </w:p>
     <w:p>
-      <w:pPr>
-        <w:rPr>
-          <w:b/>
-          <w:bCs/>
-        </w:rPr>
-      </w:pPr>
-    </w:p>
-    <w:p>
-      <w:pPr>
-        <w:rPr>
-          <w:b/>
-          <w:bCs/>
-        </w:rPr>
-      </w:pPr>
       <w:r>
         <w:rPr>
           <w:b/>
@@ -391,7 +338,7 @@
       <w:pPr>
         <w:numPr>
           <w:ilvl w:val="0"/>
-          <w:numId w:val="6"/>
+          <w:numId w:val="16"/>
         </w:numPr>
       </w:pPr>
       <w:r>
@@ -402,7 +349,7 @@
       <w:pPr>
         <w:numPr>
           <w:ilvl w:val="0"/>
-          <w:numId w:val="6"/>
+          <w:numId w:val="16"/>
         </w:numPr>
       </w:pPr>
       <w:r>
@@ -413,7 +360,7 @@
       <w:pPr>
         <w:numPr>
           <w:ilvl w:val="0"/>
-          <w:numId w:val="6"/>
+          <w:numId w:val="16"/>
         </w:numPr>
       </w:pPr>
       <w:r>
@@ -424,7 +371,7 @@
       <w:pPr>
         <w:numPr>
           <w:ilvl w:val="0"/>
-          <w:numId w:val="6"/>
+          <w:numId w:val="16"/>
         </w:numPr>
       </w:pPr>
       <w:r>
@@ -435,7 +382,7 @@
       <w:pPr>
         <w:numPr>
           <w:ilvl w:val="0"/>
-          <w:numId w:val="6"/>
+          <w:numId w:val="16"/>
         </w:numPr>
       </w:pPr>
       <w:r>
@@ -446,7 +393,7 @@
       <w:pPr>
         <w:numPr>
           <w:ilvl w:val="0"/>
-          <w:numId w:val="6"/>
+          <w:numId w:val="16"/>
         </w:numPr>
       </w:pPr>
       <w:r>
@@ -457,7 +404,7 @@
       <w:pPr>
         <w:numPr>
           <w:ilvl w:val="0"/>
-          <w:numId w:val="6"/>
+          <w:numId w:val="16"/>
         </w:numPr>
       </w:pPr>
       <w:r>
@@ -465,20 +412,6 @@
       </w:r>
     </w:p>
     <w:p>
-      <w:pPr>
-        <w:rPr>
-          <w:b/>
-          <w:bCs/>
-        </w:rPr>
-      </w:pPr>
-    </w:p>
-    <w:p>
-      <w:pPr>
-        <w:rPr>
-          <w:b/>
-          <w:bCs/>
-        </w:rPr>
-      </w:pPr>
       <w:r>
         <w:rPr>
           <w:b/>
@@ -491,7 +424,7 @@
       <w:pPr>
         <w:numPr>
           <w:ilvl w:val="0"/>
-          <w:numId w:val="7"/>
+          <w:numId w:val="17"/>
         </w:numPr>
       </w:pPr>
       <w:r>
@@ -502,7 +435,7 @@
       <w:pPr>
         <w:numPr>
           <w:ilvl w:val="0"/>
-          <w:numId w:val="7"/>
+          <w:numId w:val="17"/>
         </w:numPr>
       </w:pPr>
       <w:r>
@@ -510,26 +443,11 @@
       </w:r>
     </w:p>
     <w:p>
-      <w:pPr>
+      <w:r>
         <w:rPr>
           <w:b/>
           <w:bCs/>
         </w:rPr>
-      </w:pPr>
-    </w:p>
-    <w:p>
-      <w:pPr>
-        <w:rPr>
-          <w:b/>
-          <w:bCs/>
-        </w:rPr>
-      </w:pPr>
-      <w:r>
-        <w:rPr>
-          <w:b/>
-          <w:bCs/>
-        </w:rPr>
-        <w:lastRenderedPageBreak/>
         <w:t>8. Development Milestones</w:t>
       </w:r>
     </w:p>
@@ -537,7 +455,7 @@
       <w:pPr>
         <w:numPr>
           <w:ilvl w:val="0"/>
-          <w:numId w:val="8"/>
+          <w:numId w:val="18"/>
         </w:numPr>
       </w:pPr>
       <w:r>
@@ -548,21 +466,30 @@
       <w:pPr>
         <w:numPr>
           <w:ilvl w:val="0"/>
-          <w:numId w:val="8"/>
+          <w:numId w:val="18"/>
         </w:numPr>
       </w:pPr>
       <w:r>
-        <w:t xml:space="preserve">[x] Milestone 2: Security Engine: Global Middlewares (Context-Aware XSS Template Engine, CSRF, Security Headers, Rate Limiting). </w:t>
+        <w:t xml:space="preserve">[x] Milestone 2: Security Engine: Global </w:t>
+      </w:r>
+      <w:proofErr w:type="spellStart"/>
+      <w:r>
+        <w:t>Middlewares</w:t>
+      </w:r>
+      <w:proofErr w:type="spellEnd"/>
+      <w:r>
+        <w:t xml:space="preserve"> (Context-Aware XSS Template Engine, CSRF, Security Headers, Rate Limiting). </w:t>
       </w:r>
     </w:p>
     <w:p>
       <w:pPr>
         <w:numPr>
           <w:ilvl w:val="0"/>
-          <w:numId w:val="8"/>
+          <w:numId w:val="18"/>
         </w:numPr>
       </w:pPr>
       <w:r>
+        <w:lastRenderedPageBreak/>
         <w:t xml:space="preserve">[x] Milestone 3: Auth &amp; Audit: Authentication Module, RBAC, and Security Logger. </w:t>
       </w:r>
     </w:p>
@@ -570,68 +497,36 @@
       <w:pPr>
         <w:numPr>
           <w:ilvl w:val="0"/>
-          <w:numId w:val="8"/>
+          <w:numId w:val="18"/>
         </w:numPr>
       </w:pPr>
       <w:r>
-        <w:t>[</w:t>
-      </w:r>
-      <w:r>
-        <w:t>x</w:t>
-      </w:r>
-      <w:r>
-        <w:t xml:space="preserve">] Milestone 4: Prototype Construction: Building Version A (Baseline) and Version B (Secure CMS). </w:t>
+        <w:t xml:space="preserve">[x] Milestone 4: Prototype Construction: Building Version A (Baseline) and Version B (Secure CMS). </w:t>
       </w:r>
     </w:p>
     <w:p>
       <w:pPr>
         <w:numPr>
           <w:ilvl w:val="0"/>
-          <w:numId w:val="8"/>
+          <w:numId w:val="18"/>
         </w:numPr>
       </w:pPr>
       <w:r>
-        <w:t>[</w:t>
-      </w:r>
-      <w:r>
-        <w:t>x</w:t>
-      </w:r>
-      <w:r>
-        <w:t xml:space="preserve">] Milestone 5: Security Testing: OWASP ZAP DAST scanning and Manual Penetration Testing. </w:t>
+        <w:t xml:space="preserve">[x] Milestone 5: Security Testing: OWASP ZAP DAST scanning and Manual Penetration Testing. </w:t>
       </w:r>
     </w:p>
     <w:p>
       <w:pPr>
         <w:numPr>
           <w:ilvl w:val="0"/>
-          <w:numId w:val="8"/>
+          <w:numId w:val="18"/>
         </w:numPr>
       </w:pPr>
       <w:r>
-        <w:t>[</w:t>
-      </w:r>
-      <w:r>
-        <w:t>-</w:t>
-      </w:r>
-      <w:r>
-        <w:t xml:space="preserve">] Milestone 6: Final Handoff: Code delivery, evidence compilation, and documentation. </w:t>
-      </w:r>
-    </w:p>
-    <w:p>
-      <w:pPr>
-        <w:rPr>
-          <w:b/>
-          <w:bCs/>
-        </w:rPr>
-      </w:pPr>
-    </w:p>
-    <w:p>
-      <w:pPr>
-        <w:rPr>
-          <w:b/>
-          <w:bCs/>
-        </w:rPr>
-      </w:pPr>
+        <w:t xml:space="preserve">[-] Milestone 6: Final Handoff: Code delivery, evidence compilation, and documentation. </w:t>
+      </w:r>
+    </w:p>
+    <w:p>
       <w:r>
         <w:rPr>
           <w:b/>
@@ -644,68 +539,36 @@
       <w:pPr>
         <w:numPr>
           <w:ilvl w:val="0"/>
-          <w:numId w:val="9"/>
+          <w:numId w:val="19"/>
         </w:numPr>
       </w:pPr>
       <w:r>
-        <w:t>[</w:t>
-      </w:r>
-      <w:r>
-        <w:t>x</w:t>
-      </w:r>
-      <w:r>
-        <w:t xml:space="preserve">] OWASP ZAP Scan Reports. </w:t>
+        <w:t xml:space="preserve">[x] OWASP ZAP Scan Reports. </w:t>
       </w:r>
     </w:p>
     <w:p>
       <w:pPr>
         <w:numPr>
           <w:ilvl w:val="0"/>
-          <w:numId w:val="9"/>
+          <w:numId w:val="19"/>
         </w:numPr>
       </w:pPr>
       <w:r>
-        <w:t>[</w:t>
-      </w:r>
-      <w:r>
-        <w:t>x</w:t>
-      </w:r>
-      <w:r>
-        <w:t xml:space="preserve">] Manual Testing Logs. </w:t>
+        <w:t xml:space="preserve">[x] Manual Testing Logs. </w:t>
       </w:r>
     </w:p>
     <w:p>
       <w:pPr>
         <w:numPr>
           <w:ilvl w:val="0"/>
-          <w:numId w:val="9"/>
+          <w:numId w:val="19"/>
         </w:numPr>
       </w:pPr>
       <w:r>
-        <w:t>[</w:t>
-      </w:r>
-      <w:r>
-        <w:t>-</w:t>
-      </w:r>
-      <w:r>
-        <w:t xml:space="preserve">] Security Improvement Comparison Report. </w:t>
-      </w:r>
-    </w:p>
-    <w:p>
-      <w:pPr>
-        <w:rPr>
-          <w:b/>
-          <w:bCs/>
-        </w:rPr>
-      </w:pPr>
-    </w:p>
-    <w:p>
-      <w:pPr>
-        <w:rPr>
-          <w:b/>
-          <w:bCs/>
-        </w:rPr>
-      </w:pPr>
+        <w:t xml:space="preserve">[-] Security Improvement Comparison Report. </w:t>
+      </w:r>
+    </w:p>
+    <w:p>
       <w:r>
         <w:rPr>
           <w:b/>
@@ -718,7 +581,7 @@
       <w:pPr>
         <w:numPr>
           <w:ilvl w:val="0"/>
-          <w:numId w:val="10"/>
+          <w:numId w:val="20"/>
         </w:numPr>
       </w:pPr>
       <w:r>
@@ -729,7 +592,7 @@
       <w:pPr>
         <w:numPr>
           <w:ilvl w:val="0"/>
-          <w:numId w:val="10"/>
+          <w:numId w:val="20"/>
         </w:numPr>
       </w:pPr>
       <w:r>
@@ -740,68 +603,44 @@
       <w:pPr>
         <w:numPr>
           <w:ilvl w:val="0"/>
-          <w:numId w:val="10"/>
+          <w:numId w:val="20"/>
         </w:numPr>
       </w:pPr>
       <w:r>
-        <w:t>[</w:t>
-      </w:r>
-      <w:r>
-        <w:t>x</w:t>
-      </w:r>
-      <w:r>
-        <w:t xml:space="preserve">] STRIDE Threat Model &amp; Attack Surface Analysis Table. </w:t>
+        <w:t xml:space="preserve">[x] STRIDE Threat Model &amp; Attack Surface Analysis Table. </w:t>
       </w:r>
     </w:p>
     <w:p>
       <w:pPr>
         <w:numPr>
           <w:ilvl w:val="0"/>
-          <w:numId w:val="10"/>
+          <w:numId w:val="20"/>
         </w:numPr>
       </w:pPr>
       <w:r>
-        <w:t>[</w:t>
-      </w:r>
-      <w:r>
-        <w:t>x</w:t>
-      </w:r>
-      <w:r>
-        <w:t xml:space="preserve">] Before/After Screenshots. </w:t>
+        <w:t xml:space="preserve">[x] Before/After Screenshots. </w:t>
       </w:r>
     </w:p>
     <w:p>
       <w:pPr>
         <w:numPr>
           <w:ilvl w:val="0"/>
-          <w:numId w:val="10"/>
+          <w:numId w:val="20"/>
         </w:numPr>
       </w:pPr>
       <w:r>
-        <w:t>[</w:t>
-      </w:r>
-      <w:r>
-        <w:t>x</w:t>
-      </w:r>
-      <w:r>
-        <w:t xml:space="preserve">] Raw Audit Logs catching penetration testing attempts. </w:t>
+        <w:t xml:space="preserve">[x] Raw Audit Logs catching penetration testing attempts. </w:t>
       </w:r>
     </w:p>
     <w:p>
       <w:pPr>
         <w:numPr>
           <w:ilvl w:val="0"/>
-          <w:numId w:val="10"/>
+          <w:numId w:val="20"/>
         </w:numPr>
       </w:pPr>
       <w:r>
-        <w:t>[</w:t>
-      </w:r>
-      <w:r>
-        <w:t>x</w:t>
-      </w:r>
-      <w:r>
-        <w:t xml:space="preserve">] Comparative Vulnerability Tables. </w:t>
+        <w:t xml:space="preserve">[x] Comparative Vulnerability Tables. </w:t>
       </w:r>
     </w:p>
     <w:p/>
@@ -816,8 +655,157 @@
 </file>
 
 <file path=word/numbering.xml><?xml version="1.0" encoding="utf-8"?>
-<w:numbering xmlns:wpc="http://schemas.microsoft.com/office/word/2010/wordprocessingCanvas" xmlns:cx="http://schemas.microsoft.com/office/drawing/2014/chartex" xmlns:cx1="http://schemas.microsoft.com/office/drawing/2015/9/8/chartex" xmlns:cx2="http://schemas.microsoft.com/office/drawing/2015/10/21/chartex" xmlns:cx3="http://schemas.microsoft.com/office/drawing/2016/5/9/chartex" xmlns:cx4="http://schemas.microsoft.com/office/drawing/2016/5/10/chartex" xmlns:cx5="http://schemas.microsoft.com/office/drawing/2016/5/11/chartex" xmlns:cx6="http://schemas.microsoft.com/office/drawing/2016/5/12/chartex" xmlns:cx7="http://schemas.microsoft.com/office/drawing/2016/5/13/chartex" xmlns:cx8="http://schemas.microsoft.com/office/drawing/2016/5/14/chartex" xmlns:mc="http://schemas.openxmlformats.org/markup-compatibility/2006" xmlns:aink="http://schemas.microsoft.com/office/drawing/2016/ink" xmlns:am3d="http://schemas.microsoft.com/office/drawing/2017/model3d" xmlns:o="urn:schemas-microsoft-com:office:office" xmlns:oel="http://schemas.microsoft.com/office/2019/extlst" xmlns:r="http://schemas.openxmlformats.org/officeDocument/2006/relationships" xmlns:m="http://schemas.openxmlformats.org/officeDocument/2006/math" xmlns:v="urn:schemas-microsoft-com:vml" xmlns:wp14="http://schemas.microsoft.com/office/word/2010/wordprocessingDrawing" xmlns:wp="http://schemas.openxmlformats.org/drawingml/2006/wordprocessingDrawing" xmlns:w10="urn:schemas-microsoft-com:office:word" xmlns:w="http://schemas.openxmlformats.org/wordprocessingml/2006/main" xmlns:w14="http://schemas.microsoft.com/office/word/2010/wordml" xmlns:w15="http://schemas.microsoft.com/office/word/2012/wordml" xmlns:w16cex="http://schemas.microsoft.com/office/word/2018/wordml/cex" xmlns:w16cid="http://schemas.microsoft.com/office/word/2016/wordml/cid" xmlns:w16="http://schemas.microsoft.com/office/word/2018/wordml" xmlns:w16du="http://schemas.microsoft.com/office/word/2023/wordml/word16du" xmlns:w16sdtdh="http://schemas.microsoft.com/office/word/2020/wordml/sdtdatahash" xmlns:w16sdtfl="http://schemas.microsoft.com/office/word/2024/wordml/sdtformatlock" xmlns:w16se="http://schemas.microsoft.com/office/word/2015/wordml/symex" xmlns:wpg="http://schemas.microsoft.com/office/word/2010/wordprocessingGroup" xmlns:wpi="http://schemas.microsoft.com/office/word/2010/wordprocessingInk" xmlns:wne="http://schemas.microsoft.com/office/word/2006/wordml" xmlns:wps="http://schemas.microsoft.com/office/word/2010/wordprocessingShape" mc:Ignorable="w14 w15 w16se w16cid w16 w16cex w16sdtdh w16sdtfl w16du wp14">
+<w:numbering xmlns:wpc="http://schemas.microsoft.com/office/word/2010/wordprocessingCanvas" xmlns:cx="http://schemas.microsoft.com/office/drawing/2014/chartex" xmlns:cx1="http://schemas.microsoft.com/office/drawing/2015/9/8/chartex" xmlns:cx2="http://schemas.microsoft.com/office/drawing/2015/10/21/chartex" xmlns:cx3="http://schemas.microsoft.com/office/drawing/2016/5/9/chartex" xmlns:cx4="http://schemas.microsoft.com/office/drawing/2016/5/10/chartex" xmlns:cx5="http://schemas.microsoft.com/office/drawing/2016/5/11/chartex" xmlns:cx6="http://schemas.microsoft.com/office/drawing/2016/5/12/chartex" xmlns:cx7="http://schemas.microsoft.com/office/drawing/2016/5/13/chartex" xmlns:cx8="http://schemas.microsoft.com/office/drawing/2016/5/14/chartex" xmlns:mc="http://schemas.openxmlformats.org/markup-compatibility/2006" xmlns:aink="http://schemas.microsoft.com/office/drawing/2016/ink" xmlns:am3d="http://schemas.microsoft.com/office/drawing/2017/model3d" xmlns:o="urn:schemas-microsoft-com:office:office" xmlns:oel="http://schemas.microsoft.com/office/2019/extlst" xmlns:r="http://schemas.openxmlformats.org/officeDocument/2006/relationships" xmlns:m="http://schemas.openxmlformats.org/officeDocument/2006/math" xmlns:v="urn:schemas-microsoft-com:vml" xmlns:wp14="http://schemas.microsoft.com/office/word/2010/wordprocessingDrawing" xmlns:wp="http://schemas.openxmlformats.org/drawingml/2006/wordprocessingDrawing" xmlns:w10="urn:schemas-microsoft-com:office:word" xmlns:w="http://schemas.openxmlformats.org/wordprocessingml/2006/main" xmlns:w14="http://schemas.microsoft.com/office/word/2010/wordml" xmlns:w15="http://schemas.microsoft.com/office/word/2012/wordml" xmlns:w16cei="http://schemas.microsoft.com/office/word/2026/wordml/cei" xmlns:w16cex="http://schemas.microsoft.com/office/word/2018/wordml/cex" xmlns:w16cid="http://schemas.microsoft.com/office/word/2016/wordml/cid" xmlns:w16="http://schemas.microsoft.com/office/word/2018/wordml" xmlns:w16du="http://schemas.microsoft.com/office/word/2023/wordml/word16du" xmlns:w16sdtdh="http://schemas.microsoft.com/office/word/2020/wordml/sdtdatahash" xmlns:w16sdtfl="http://schemas.microsoft.com/office/word/2024/wordml/sdtformatlock" xmlns:w16se="http://schemas.microsoft.com/office/word/2015/wordml/symex" xmlns:wpg="http://schemas.microsoft.com/office/word/2010/wordprocessingGroup" xmlns:wpi="http://schemas.microsoft.com/office/word/2010/wordprocessingInk" xmlns:wne="http://schemas.microsoft.com/office/word/2006/wordml" xmlns:wps="http://schemas.microsoft.com/office/word/2010/wordprocessingShape" mc:Ignorable="w14 w15 w16se w16cid w16 w16cex w16sdtdh w16sdtfl w16du wp14">
   <w:abstractNum w:abstractNumId="0" w15:restartNumberingAfterBreak="0">
+    <w:nsid w:val="084E3DCA"/>
+    <w:multiLevelType w:val="multilevel"/>
+    <w:tmpl w:val="492A1E98"/>
+    <w:lvl w:ilvl="0">
+      <w:start w:val="1"/>
+      <w:numFmt w:val="bullet"/>
+      <w:lvlText w:val=""/>
+      <w:lvlJc w:val="left"/>
+      <w:pPr>
+        <w:tabs>
+          <w:tab w:val="num" w:pos="720"/>
+        </w:tabs>
+        <w:ind w:left="720" w:hanging="360"/>
+      </w:pPr>
+      <w:rPr>
+        <w:rFonts w:ascii="Symbol" w:hAnsi="Symbol" w:hint="default"/>
+        <w:sz w:val="20"/>
+      </w:rPr>
+    </w:lvl>
+    <w:lvl w:ilvl="1" w:tentative="1">
+      <w:start w:val="1"/>
+      <w:numFmt w:val="bullet"/>
+      <w:lvlText w:val="o"/>
+      <w:lvlJc w:val="left"/>
+      <w:pPr>
+        <w:tabs>
+          <w:tab w:val="num" w:pos="1440"/>
+        </w:tabs>
+        <w:ind w:left="1440" w:hanging="360"/>
+      </w:pPr>
+      <w:rPr>
+        <w:rFonts w:ascii="Courier New" w:hAnsi="Courier New" w:hint="default"/>
+        <w:sz w:val="20"/>
+      </w:rPr>
+    </w:lvl>
+    <w:lvl w:ilvl="2" w:tentative="1">
+      <w:start w:val="1"/>
+      <w:numFmt w:val="bullet"/>
+      <w:lvlText w:val=""/>
+      <w:lvlJc w:val="left"/>
+      <w:pPr>
+        <w:tabs>
+          <w:tab w:val="num" w:pos="2160"/>
+        </w:tabs>
+        <w:ind w:left="2160" w:hanging="360"/>
+      </w:pPr>
+      <w:rPr>
+        <w:rFonts w:ascii="Wingdings" w:hAnsi="Wingdings" w:hint="default"/>
+        <w:sz w:val="20"/>
+      </w:rPr>
+    </w:lvl>
+    <w:lvl w:ilvl="3" w:tentative="1">
+      <w:start w:val="1"/>
+      <w:numFmt w:val="bullet"/>
+      <w:lvlText w:val=""/>
+      <w:lvlJc w:val="left"/>
+      <w:pPr>
+        <w:tabs>
+          <w:tab w:val="num" w:pos="2880"/>
+        </w:tabs>
+        <w:ind w:left="2880" w:hanging="360"/>
+      </w:pPr>
+      <w:rPr>
+        <w:rFonts w:ascii="Wingdings" w:hAnsi="Wingdings" w:hint="default"/>
+        <w:sz w:val="20"/>
+      </w:rPr>
+    </w:lvl>
+    <w:lvl w:ilvl="4" w:tentative="1">
+      <w:start w:val="1"/>
+      <w:numFmt w:val="bullet"/>
+      <w:lvlText w:val=""/>
+      <w:lvlJc w:val="left"/>
+      <w:pPr>
+        <w:tabs>
+          <w:tab w:val="num" w:pos="3600"/>
+        </w:tabs>
+        <w:ind w:left="3600" w:hanging="360"/>
+      </w:pPr>
+      <w:rPr>
+        <w:rFonts w:ascii="Wingdings" w:hAnsi="Wingdings" w:hint="default"/>
+        <w:sz w:val="20"/>
+      </w:rPr>
+    </w:lvl>
+    <w:lvl w:ilvl="5" w:tentative="1">
+      <w:start w:val="1"/>
+      <w:numFmt w:val="bullet"/>
+      <w:lvlText w:val=""/>
+      <w:lvlJc w:val="left"/>
+      <w:pPr>
+        <w:tabs>
+          <w:tab w:val="num" w:pos="4320"/>
+        </w:tabs>
+        <w:ind w:left="4320" w:hanging="360"/>
+      </w:pPr>
+      <w:rPr>
+        <w:rFonts w:ascii="Wingdings" w:hAnsi="Wingdings" w:hint="default"/>
+        <w:sz w:val="20"/>
+      </w:rPr>
+    </w:lvl>
+    <w:lvl w:ilvl="6" w:tentative="1">
+      <w:start w:val="1"/>
+      <w:numFmt w:val="bullet"/>
+      <w:lvlText w:val=""/>
+      <w:lvlJc w:val="left"/>
+      <w:pPr>
+        <w:tabs>
+          <w:tab w:val="num" w:pos="5040"/>
+        </w:tabs>
+        <w:ind w:left="5040" w:hanging="360"/>
+      </w:pPr>
+      <w:rPr>
+        <w:rFonts w:ascii="Wingdings" w:hAnsi="Wingdings" w:hint="default"/>
+        <w:sz w:val="20"/>
+      </w:rPr>
+    </w:lvl>
+    <w:lvl w:ilvl="7" w:tentative="1">
+      <w:start w:val="1"/>
+      <w:numFmt w:val="bullet"/>
+      <w:lvlText w:val=""/>
+      <w:lvlJc w:val="left"/>
+      <w:pPr>
+        <w:tabs>
+          <w:tab w:val="num" w:pos="5760"/>
+        </w:tabs>
+        <w:ind w:left="5760" w:hanging="360"/>
+      </w:pPr>
+      <w:rPr>
+        <w:rFonts w:ascii="Wingdings" w:hAnsi="Wingdings" w:hint="default"/>
+        <w:sz w:val="20"/>
+      </w:rPr>
+    </w:lvl>
+    <w:lvl w:ilvl="8" w:tentative="1">
+      <w:start w:val="1"/>
+      <w:numFmt w:val="bullet"/>
+      <w:lvlText w:val=""/>
+      <w:lvlJc w:val="left"/>
+      <w:pPr>
+        <w:tabs>
+          <w:tab w:val="num" w:pos="6480"/>
+        </w:tabs>
+        <w:ind w:left="6480" w:hanging="360"/>
+      </w:pPr>
+      <w:rPr>
+        <w:rFonts w:ascii="Wingdings" w:hAnsi="Wingdings" w:hint="default"/>
+        <w:sz w:val="20"/>
+      </w:rPr>
+    </w:lvl>
+  </w:abstractNum>
+  <w:abstractNum w:abstractNumId="1" w15:restartNumberingAfterBreak="0">
     <w:nsid w:val="09681D65"/>
     <w:multiLevelType w:val="multilevel"/>
     <w:tmpl w:val="C242E43E"/>
@@ -966,7 +954,7 @@
       </w:rPr>
     </w:lvl>
   </w:abstractNum>
-  <w:abstractNum w:abstractNumId="1" w15:restartNumberingAfterBreak="0">
+  <w:abstractNum w:abstractNumId="2" w15:restartNumberingAfterBreak="0">
     <w:nsid w:val="0BCE0C66"/>
     <w:multiLevelType w:val="multilevel"/>
     <w:tmpl w:val="BF2695BA"/>
@@ -1115,7 +1103,7 @@
       </w:rPr>
     </w:lvl>
   </w:abstractNum>
-  <w:abstractNum w:abstractNumId="2" w15:restartNumberingAfterBreak="0">
+  <w:abstractNum w:abstractNumId="3" w15:restartNumberingAfterBreak="0">
     <w:nsid w:val="10FC4F1B"/>
     <w:multiLevelType w:val="multilevel"/>
     <w:tmpl w:val="EE3E7572"/>
@@ -1264,7 +1252,7 @@
       </w:rPr>
     </w:lvl>
   </w:abstractNum>
-  <w:abstractNum w:abstractNumId="3" w15:restartNumberingAfterBreak="0">
+  <w:abstractNum w:abstractNumId="4" w15:restartNumberingAfterBreak="0">
     <w:nsid w:val="17817759"/>
     <w:multiLevelType w:val="multilevel"/>
     <w:tmpl w:val="B79C60FC"/>
@@ -1413,7 +1401,901 @@
       </w:rPr>
     </w:lvl>
   </w:abstractNum>
-  <w:abstractNum w:abstractNumId="4" w15:restartNumberingAfterBreak="0">
+  <w:abstractNum w:abstractNumId="5" w15:restartNumberingAfterBreak="0">
+    <w:nsid w:val="1C146924"/>
+    <w:multiLevelType w:val="multilevel"/>
+    <w:tmpl w:val="AB52F97E"/>
+    <w:lvl w:ilvl="0">
+      <w:start w:val="1"/>
+      <w:numFmt w:val="bullet"/>
+      <w:lvlText w:val=""/>
+      <w:lvlJc w:val="left"/>
+      <w:pPr>
+        <w:tabs>
+          <w:tab w:val="num" w:pos="720"/>
+        </w:tabs>
+        <w:ind w:left="720" w:hanging="360"/>
+      </w:pPr>
+      <w:rPr>
+        <w:rFonts w:ascii="Symbol" w:hAnsi="Symbol" w:hint="default"/>
+        <w:sz w:val="20"/>
+      </w:rPr>
+    </w:lvl>
+    <w:lvl w:ilvl="1" w:tentative="1">
+      <w:start w:val="1"/>
+      <w:numFmt w:val="bullet"/>
+      <w:lvlText w:val="o"/>
+      <w:lvlJc w:val="left"/>
+      <w:pPr>
+        <w:tabs>
+          <w:tab w:val="num" w:pos="1440"/>
+        </w:tabs>
+        <w:ind w:left="1440" w:hanging="360"/>
+      </w:pPr>
+      <w:rPr>
+        <w:rFonts w:ascii="Courier New" w:hAnsi="Courier New" w:hint="default"/>
+        <w:sz w:val="20"/>
+      </w:rPr>
+    </w:lvl>
+    <w:lvl w:ilvl="2" w:tentative="1">
+      <w:start w:val="1"/>
+      <w:numFmt w:val="bullet"/>
+      <w:lvlText w:val=""/>
+      <w:lvlJc w:val="left"/>
+      <w:pPr>
+        <w:tabs>
+          <w:tab w:val="num" w:pos="2160"/>
+        </w:tabs>
+        <w:ind w:left="2160" w:hanging="360"/>
+      </w:pPr>
+      <w:rPr>
+        <w:rFonts w:ascii="Wingdings" w:hAnsi="Wingdings" w:hint="default"/>
+        <w:sz w:val="20"/>
+      </w:rPr>
+    </w:lvl>
+    <w:lvl w:ilvl="3" w:tentative="1">
+      <w:start w:val="1"/>
+      <w:numFmt w:val="bullet"/>
+      <w:lvlText w:val=""/>
+      <w:lvlJc w:val="left"/>
+      <w:pPr>
+        <w:tabs>
+          <w:tab w:val="num" w:pos="2880"/>
+        </w:tabs>
+        <w:ind w:left="2880" w:hanging="360"/>
+      </w:pPr>
+      <w:rPr>
+        <w:rFonts w:ascii="Wingdings" w:hAnsi="Wingdings" w:hint="default"/>
+        <w:sz w:val="20"/>
+      </w:rPr>
+    </w:lvl>
+    <w:lvl w:ilvl="4" w:tentative="1">
+      <w:start w:val="1"/>
+      <w:numFmt w:val="bullet"/>
+      <w:lvlText w:val=""/>
+      <w:lvlJc w:val="left"/>
+      <w:pPr>
+        <w:tabs>
+          <w:tab w:val="num" w:pos="3600"/>
+        </w:tabs>
+        <w:ind w:left="3600" w:hanging="360"/>
+      </w:pPr>
+      <w:rPr>
+        <w:rFonts w:ascii="Wingdings" w:hAnsi="Wingdings" w:hint="default"/>
+        <w:sz w:val="20"/>
+      </w:rPr>
+    </w:lvl>
+    <w:lvl w:ilvl="5" w:tentative="1">
+      <w:start w:val="1"/>
+      <w:numFmt w:val="bullet"/>
+      <w:lvlText w:val=""/>
+      <w:lvlJc w:val="left"/>
+      <w:pPr>
+        <w:tabs>
+          <w:tab w:val="num" w:pos="4320"/>
+        </w:tabs>
+        <w:ind w:left="4320" w:hanging="360"/>
+      </w:pPr>
+      <w:rPr>
+        <w:rFonts w:ascii="Wingdings" w:hAnsi="Wingdings" w:hint="default"/>
+        <w:sz w:val="20"/>
+      </w:rPr>
+    </w:lvl>
+    <w:lvl w:ilvl="6" w:tentative="1">
+      <w:start w:val="1"/>
+      <w:numFmt w:val="bullet"/>
+      <w:lvlText w:val=""/>
+      <w:lvlJc w:val="left"/>
+      <w:pPr>
+        <w:tabs>
+          <w:tab w:val="num" w:pos="5040"/>
+        </w:tabs>
+        <w:ind w:left="5040" w:hanging="360"/>
+      </w:pPr>
+      <w:rPr>
+        <w:rFonts w:ascii="Wingdings" w:hAnsi="Wingdings" w:hint="default"/>
+        <w:sz w:val="20"/>
+      </w:rPr>
+    </w:lvl>
+    <w:lvl w:ilvl="7" w:tentative="1">
+      <w:start w:val="1"/>
+      <w:numFmt w:val="bullet"/>
+      <w:lvlText w:val=""/>
+      <w:lvlJc w:val="left"/>
+      <w:pPr>
+        <w:tabs>
+          <w:tab w:val="num" w:pos="5760"/>
+        </w:tabs>
+        <w:ind w:left="5760" w:hanging="360"/>
+      </w:pPr>
+      <w:rPr>
+        <w:rFonts w:ascii="Wingdings" w:hAnsi="Wingdings" w:hint="default"/>
+        <w:sz w:val="20"/>
+      </w:rPr>
+    </w:lvl>
+    <w:lvl w:ilvl="8" w:tentative="1">
+      <w:start w:val="1"/>
+      <w:numFmt w:val="bullet"/>
+      <w:lvlText w:val=""/>
+      <w:lvlJc w:val="left"/>
+      <w:pPr>
+        <w:tabs>
+          <w:tab w:val="num" w:pos="6480"/>
+        </w:tabs>
+        <w:ind w:left="6480" w:hanging="360"/>
+      </w:pPr>
+      <w:rPr>
+        <w:rFonts w:ascii="Wingdings" w:hAnsi="Wingdings" w:hint="default"/>
+        <w:sz w:val="20"/>
+      </w:rPr>
+    </w:lvl>
+  </w:abstractNum>
+  <w:abstractNum w:abstractNumId="6" w15:restartNumberingAfterBreak="0">
+    <w:nsid w:val="2089560D"/>
+    <w:multiLevelType w:val="multilevel"/>
+    <w:tmpl w:val="05C4878E"/>
+    <w:lvl w:ilvl="0">
+      <w:start w:val="1"/>
+      <w:numFmt w:val="bullet"/>
+      <w:lvlText w:val=""/>
+      <w:lvlJc w:val="left"/>
+      <w:pPr>
+        <w:tabs>
+          <w:tab w:val="num" w:pos="720"/>
+        </w:tabs>
+        <w:ind w:left="720" w:hanging="360"/>
+      </w:pPr>
+      <w:rPr>
+        <w:rFonts w:ascii="Symbol" w:hAnsi="Symbol" w:hint="default"/>
+        <w:sz w:val="20"/>
+      </w:rPr>
+    </w:lvl>
+    <w:lvl w:ilvl="1" w:tentative="1">
+      <w:start w:val="1"/>
+      <w:numFmt w:val="bullet"/>
+      <w:lvlText w:val="o"/>
+      <w:lvlJc w:val="left"/>
+      <w:pPr>
+        <w:tabs>
+          <w:tab w:val="num" w:pos="1440"/>
+        </w:tabs>
+        <w:ind w:left="1440" w:hanging="360"/>
+      </w:pPr>
+      <w:rPr>
+        <w:rFonts w:ascii="Courier New" w:hAnsi="Courier New" w:hint="default"/>
+        <w:sz w:val="20"/>
+      </w:rPr>
+    </w:lvl>
+    <w:lvl w:ilvl="2" w:tentative="1">
+      <w:start w:val="1"/>
+      <w:numFmt w:val="bullet"/>
+      <w:lvlText w:val=""/>
+      <w:lvlJc w:val="left"/>
+      <w:pPr>
+        <w:tabs>
+          <w:tab w:val="num" w:pos="2160"/>
+        </w:tabs>
+        <w:ind w:left="2160" w:hanging="360"/>
+      </w:pPr>
+      <w:rPr>
+        <w:rFonts w:ascii="Wingdings" w:hAnsi="Wingdings" w:hint="default"/>
+        <w:sz w:val="20"/>
+      </w:rPr>
+    </w:lvl>
+    <w:lvl w:ilvl="3" w:tentative="1">
+      <w:start w:val="1"/>
+      <w:numFmt w:val="bullet"/>
+      <w:lvlText w:val=""/>
+      <w:lvlJc w:val="left"/>
+      <w:pPr>
+        <w:tabs>
+          <w:tab w:val="num" w:pos="2880"/>
+        </w:tabs>
+        <w:ind w:left="2880" w:hanging="360"/>
+      </w:pPr>
+      <w:rPr>
+        <w:rFonts w:ascii="Wingdings" w:hAnsi="Wingdings" w:hint="default"/>
+        <w:sz w:val="20"/>
+      </w:rPr>
+    </w:lvl>
+    <w:lvl w:ilvl="4" w:tentative="1">
+      <w:start w:val="1"/>
+      <w:numFmt w:val="bullet"/>
+      <w:lvlText w:val=""/>
+      <w:lvlJc w:val="left"/>
+      <w:pPr>
+        <w:tabs>
+          <w:tab w:val="num" w:pos="3600"/>
+        </w:tabs>
+        <w:ind w:left="3600" w:hanging="360"/>
+      </w:pPr>
+      <w:rPr>
+        <w:rFonts w:ascii="Wingdings" w:hAnsi="Wingdings" w:hint="default"/>
+        <w:sz w:val="20"/>
+      </w:rPr>
+    </w:lvl>
+    <w:lvl w:ilvl="5" w:tentative="1">
+      <w:start w:val="1"/>
+      <w:numFmt w:val="bullet"/>
+      <w:lvlText w:val=""/>
+      <w:lvlJc w:val="left"/>
+      <w:pPr>
+        <w:tabs>
+          <w:tab w:val="num" w:pos="4320"/>
+        </w:tabs>
+        <w:ind w:left="4320" w:hanging="360"/>
+      </w:pPr>
+      <w:rPr>
+        <w:rFonts w:ascii="Wingdings" w:hAnsi="Wingdings" w:hint="default"/>
+        <w:sz w:val="20"/>
+      </w:rPr>
+    </w:lvl>
+    <w:lvl w:ilvl="6" w:tentative="1">
+      <w:start w:val="1"/>
+      <w:numFmt w:val="bullet"/>
+      <w:lvlText w:val=""/>
+      <w:lvlJc w:val="left"/>
+      <w:pPr>
+        <w:tabs>
+          <w:tab w:val="num" w:pos="5040"/>
+        </w:tabs>
+        <w:ind w:left="5040" w:hanging="360"/>
+      </w:pPr>
+      <w:rPr>
+        <w:rFonts w:ascii="Wingdings" w:hAnsi="Wingdings" w:hint="default"/>
+        <w:sz w:val="20"/>
+      </w:rPr>
+    </w:lvl>
+    <w:lvl w:ilvl="7" w:tentative="1">
+      <w:start w:val="1"/>
+      <w:numFmt w:val="bullet"/>
+      <w:lvlText w:val=""/>
+      <w:lvlJc w:val="left"/>
+      <w:pPr>
+        <w:tabs>
+          <w:tab w:val="num" w:pos="5760"/>
+        </w:tabs>
+        <w:ind w:left="5760" w:hanging="360"/>
+      </w:pPr>
+      <w:rPr>
+        <w:rFonts w:ascii="Wingdings" w:hAnsi="Wingdings" w:hint="default"/>
+        <w:sz w:val="20"/>
+      </w:rPr>
+    </w:lvl>
+    <w:lvl w:ilvl="8" w:tentative="1">
+      <w:start w:val="1"/>
+      <w:numFmt w:val="bullet"/>
+      <w:lvlText w:val=""/>
+      <w:lvlJc w:val="left"/>
+      <w:pPr>
+        <w:tabs>
+          <w:tab w:val="num" w:pos="6480"/>
+        </w:tabs>
+        <w:ind w:left="6480" w:hanging="360"/>
+      </w:pPr>
+      <w:rPr>
+        <w:rFonts w:ascii="Wingdings" w:hAnsi="Wingdings" w:hint="default"/>
+        <w:sz w:val="20"/>
+      </w:rPr>
+    </w:lvl>
+  </w:abstractNum>
+  <w:abstractNum w:abstractNumId="7" w15:restartNumberingAfterBreak="0">
+    <w:nsid w:val="23E303FD"/>
+    <w:multiLevelType w:val="multilevel"/>
+    <w:tmpl w:val="45A8D370"/>
+    <w:lvl w:ilvl="0">
+      <w:start w:val="1"/>
+      <w:numFmt w:val="bullet"/>
+      <w:lvlText w:val=""/>
+      <w:lvlJc w:val="left"/>
+      <w:pPr>
+        <w:tabs>
+          <w:tab w:val="num" w:pos="720"/>
+        </w:tabs>
+        <w:ind w:left="720" w:hanging="360"/>
+      </w:pPr>
+      <w:rPr>
+        <w:rFonts w:ascii="Symbol" w:hAnsi="Symbol" w:hint="default"/>
+        <w:sz w:val="20"/>
+      </w:rPr>
+    </w:lvl>
+    <w:lvl w:ilvl="1" w:tentative="1">
+      <w:start w:val="1"/>
+      <w:numFmt w:val="bullet"/>
+      <w:lvlText w:val="o"/>
+      <w:lvlJc w:val="left"/>
+      <w:pPr>
+        <w:tabs>
+          <w:tab w:val="num" w:pos="1440"/>
+        </w:tabs>
+        <w:ind w:left="1440" w:hanging="360"/>
+      </w:pPr>
+      <w:rPr>
+        <w:rFonts w:ascii="Courier New" w:hAnsi="Courier New" w:hint="default"/>
+        <w:sz w:val="20"/>
+      </w:rPr>
+    </w:lvl>
+    <w:lvl w:ilvl="2" w:tentative="1">
+      <w:start w:val="1"/>
+      <w:numFmt w:val="bullet"/>
+      <w:lvlText w:val=""/>
+      <w:lvlJc w:val="left"/>
+      <w:pPr>
+        <w:tabs>
+          <w:tab w:val="num" w:pos="2160"/>
+        </w:tabs>
+        <w:ind w:left="2160" w:hanging="360"/>
+      </w:pPr>
+      <w:rPr>
+        <w:rFonts w:ascii="Wingdings" w:hAnsi="Wingdings" w:hint="default"/>
+        <w:sz w:val="20"/>
+      </w:rPr>
+    </w:lvl>
+    <w:lvl w:ilvl="3" w:tentative="1">
+      <w:start w:val="1"/>
+      <w:numFmt w:val="bullet"/>
+      <w:lvlText w:val=""/>
+      <w:lvlJc w:val="left"/>
+      <w:pPr>
+        <w:tabs>
+          <w:tab w:val="num" w:pos="2880"/>
+        </w:tabs>
+        <w:ind w:left="2880" w:hanging="360"/>
+      </w:pPr>
+      <w:rPr>
+        <w:rFonts w:ascii="Wingdings" w:hAnsi="Wingdings" w:hint="default"/>
+        <w:sz w:val="20"/>
+      </w:rPr>
+    </w:lvl>
+    <w:lvl w:ilvl="4" w:tentative="1">
+      <w:start w:val="1"/>
+      <w:numFmt w:val="bullet"/>
+      <w:lvlText w:val=""/>
+      <w:lvlJc w:val="left"/>
+      <w:pPr>
+        <w:tabs>
+          <w:tab w:val="num" w:pos="3600"/>
+        </w:tabs>
+        <w:ind w:left="3600" w:hanging="360"/>
+      </w:pPr>
+      <w:rPr>
+        <w:rFonts w:ascii="Wingdings" w:hAnsi="Wingdings" w:hint="default"/>
+        <w:sz w:val="20"/>
+      </w:rPr>
+    </w:lvl>
+    <w:lvl w:ilvl="5" w:tentative="1">
+      <w:start w:val="1"/>
+      <w:numFmt w:val="bullet"/>
+      <w:lvlText w:val=""/>
+      <w:lvlJc w:val="left"/>
+      <w:pPr>
+        <w:tabs>
+          <w:tab w:val="num" w:pos="4320"/>
+        </w:tabs>
+        <w:ind w:left="4320" w:hanging="360"/>
+      </w:pPr>
+      <w:rPr>
+        <w:rFonts w:ascii="Wingdings" w:hAnsi="Wingdings" w:hint="default"/>
+        <w:sz w:val="20"/>
+      </w:rPr>
+    </w:lvl>
+    <w:lvl w:ilvl="6" w:tentative="1">
+      <w:start w:val="1"/>
+      <w:numFmt w:val="bullet"/>
+      <w:lvlText w:val=""/>
+      <w:lvlJc w:val="left"/>
+      <w:pPr>
+        <w:tabs>
+          <w:tab w:val="num" w:pos="5040"/>
+        </w:tabs>
+        <w:ind w:left="5040" w:hanging="360"/>
+      </w:pPr>
+      <w:rPr>
+        <w:rFonts w:ascii="Wingdings" w:hAnsi="Wingdings" w:hint="default"/>
+        <w:sz w:val="20"/>
+      </w:rPr>
+    </w:lvl>
+    <w:lvl w:ilvl="7" w:tentative="1">
+      <w:start w:val="1"/>
+      <w:numFmt w:val="bullet"/>
+      <w:lvlText w:val=""/>
+      <w:lvlJc w:val="left"/>
+      <w:pPr>
+        <w:tabs>
+          <w:tab w:val="num" w:pos="5760"/>
+        </w:tabs>
+        <w:ind w:left="5760" w:hanging="360"/>
+      </w:pPr>
+      <w:rPr>
+        <w:rFonts w:ascii="Wingdings" w:hAnsi="Wingdings" w:hint="default"/>
+        <w:sz w:val="20"/>
+      </w:rPr>
+    </w:lvl>
+    <w:lvl w:ilvl="8" w:tentative="1">
+      <w:start w:val="1"/>
+      <w:numFmt w:val="bullet"/>
+      <w:lvlText w:val=""/>
+      <w:lvlJc w:val="left"/>
+      <w:pPr>
+        <w:tabs>
+          <w:tab w:val="num" w:pos="6480"/>
+        </w:tabs>
+        <w:ind w:left="6480" w:hanging="360"/>
+      </w:pPr>
+      <w:rPr>
+        <w:rFonts w:ascii="Wingdings" w:hAnsi="Wingdings" w:hint="default"/>
+        <w:sz w:val="20"/>
+      </w:rPr>
+    </w:lvl>
+  </w:abstractNum>
+  <w:abstractNum w:abstractNumId="8" w15:restartNumberingAfterBreak="0">
+    <w:nsid w:val="282C65DF"/>
+    <w:multiLevelType w:val="multilevel"/>
+    <w:tmpl w:val="C592F550"/>
+    <w:lvl w:ilvl="0">
+      <w:start w:val="1"/>
+      <w:numFmt w:val="bullet"/>
+      <w:lvlText w:val=""/>
+      <w:lvlJc w:val="left"/>
+      <w:pPr>
+        <w:tabs>
+          <w:tab w:val="num" w:pos="720"/>
+        </w:tabs>
+        <w:ind w:left="720" w:hanging="360"/>
+      </w:pPr>
+      <w:rPr>
+        <w:rFonts w:ascii="Symbol" w:hAnsi="Symbol" w:hint="default"/>
+        <w:sz w:val="20"/>
+      </w:rPr>
+    </w:lvl>
+    <w:lvl w:ilvl="1" w:tentative="1">
+      <w:start w:val="1"/>
+      <w:numFmt w:val="bullet"/>
+      <w:lvlText w:val="o"/>
+      <w:lvlJc w:val="left"/>
+      <w:pPr>
+        <w:tabs>
+          <w:tab w:val="num" w:pos="1440"/>
+        </w:tabs>
+        <w:ind w:left="1440" w:hanging="360"/>
+      </w:pPr>
+      <w:rPr>
+        <w:rFonts w:ascii="Courier New" w:hAnsi="Courier New" w:hint="default"/>
+        <w:sz w:val="20"/>
+      </w:rPr>
+    </w:lvl>
+    <w:lvl w:ilvl="2" w:tentative="1">
+      <w:start w:val="1"/>
+      <w:numFmt w:val="bullet"/>
+      <w:lvlText w:val=""/>
+      <w:lvlJc w:val="left"/>
+      <w:pPr>
+        <w:tabs>
+          <w:tab w:val="num" w:pos="2160"/>
+        </w:tabs>
+        <w:ind w:left="2160" w:hanging="360"/>
+      </w:pPr>
+      <w:rPr>
+        <w:rFonts w:ascii="Wingdings" w:hAnsi="Wingdings" w:hint="default"/>
+        <w:sz w:val="20"/>
+      </w:rPr>
+    </w:lvl>
+    <w:lvl w:ilvl="3" w:tentative="1">
+      <w:start w:val="1"/>
+      <w:numFmt w:val="bullet"/>
+      <w:lvlText w:val=""/>
+      <w:lvlJc w:val="left"/>
+      <w:pPr>
+        <w:tabs>
+          <w:tab w:val="num" w:pos="2880"/>
+        </w:tabs>
+        <w:ind w:left="2880" w:hanging="360"/>
+      </w:pPr>
+      <w:rPr>
+        <w:rFonts w:ascii="Wingdings" w:hAnsi="Wingdings" w:hint="default"/>
+        <w:sz w:val="20"/>
+      </w:rPr>
+    </w:lvl>
+    <w:lvl w:ilvl="4" w:tentative="1">
+      <w:start w:val="1"/>
+      <w:numFmt w:val="bullet"/>
+      <w:lvlText w:val=""/>
+      <w:lvlJc w:val="left"/>
+      <w:pPr>
+        <w:tabs>
+          <w:tab w:val="num" w:pos="3600"/>
+        </w:tabs>
+        <w:ind w:left="3600" w:hanging="360"/>
+      </w:pPr>
+      <w:rPr>
+        <w:rFonts w:ascii="Wingdings" w:hAnsi="Wingdings" w:hint="default"/>
+        <w:sz w:val="20"/>
+      </w:rPr>
+    </w:lvl>
+    <w:lvl w:ilvl="5" w:tentative="1">
+      <w:start w:val="1"/>
+      <w:numFmt w:val="bullet"/>
+      <w:lvlText w:val=""/>
+      <w:lvlJc w:val="left"/>
+      <w:pPr>
+        <w:tabs>
+          <w:tab w:val="num" w:pos="4320"/>
+        </w:tabs>
+        <w:ind w:left="4320" w:hanging="360"/>
+      </w:pPr>
+      <w:rPr>
+        <w:rFonts w:ascii="Wingdings" w:hAnsi="Wingdings" w:hint="default"/>
+        <w:sz w:val="20"/>
+      </w:rPr>
+    </w:lvl>
+    <w:lvl w:ilvl="6" w:tentative="1">
+      <w:start w:val="1"/>
+      <w:numFmt w:val="bullet"/>
+      <w:lvlText w:val=""/>
+      <w:lvlJc w:val="left"/>
+      <w:pPr>
+        <w:tabs>
+          <w:tab w:val="num" w:pos="5040"/>
+        </w:tabs>
+        <w:ind w:left="5040" w:hanging="360"/>
+      </w:pPr>
+      <w:rPr>
+        <w:rFonts w:ascii="Wingdings" w:hAnsi="Wingdings" w:hint="default"/>
+        <w:sz w:val="20"/>
+      </w:rPr>
+    </w:lvl>
+    <w:lvl w:ilvl="7" w:tentative="1">
+      <w:start w:val="1"/>
+      <w:numFmt w:val="bullet"/>
+      <w:lvlText w:val=""/>
+      <w:lvlJc w:val="left"/>
+      <w:pPr>
+        <w:tabs>
+          <w:tab w:val="num" w:pos="5760"/>
+        </w:tabs>
+        <w:ind w:left="5760" w:hanging="360"/>
+      </w:pPr>
+      <w:rPr>
+        <w:rFonts w:ascii="Wingdings" w:hAnsi="Wingdings" w:hint="default"/>
+        <w:sz w:val="20"/>
+      </w:rPr>
+    </w:lvl>
+    <w:lvl w:ilvl="8" w:tentative="1">
+      <w:start w:val="1"/>
+      <w:numFmt w:val="bullet"/>
+      <w:lvlText w:val=""/>
+      <w:lvlJc w:val="left"/>
+      <w:pPr>
+        <w:tabs>
+          <w:tab w:val="num" w:pos="6480"/>
+        </w:tabs>
+        <w:ind w:left="6480" w:hanging="360"/>
+      </w:pPr>
+      <w:rPr>
+        <w:rFonts w:ascii="Wingdings" w:hAnsi="Wingdings" w:hint="default"/>
+        <w:sz w:val="20"/>
+      </w:rPr>
+    </w:lvl>
+  </w:abstractNum>
+  <w:abstractNum w:abstractNumId="9" w15:restartNumberingAfterBreak="0">
+    <w:nsid w:val="2F150470"/>
+    <w:multiLevelType w:val="multilevel"/>
+    <w:tmpl w:val="DEB2F63C"/>
+    <w:lvl w:ilvl="0">
+      <w:start w:val="1"/>
+      <w:numFmt w:val="bullet"/>
+      <w:lvlText w:val=""/>
+      <w:lvlJc w:val="left"/>
+      <w:pPr>
+        <w:tabs>
+          <w:tab w:val="num" w:pos="720"/>
+        </w:tabs>
+        <w:ind w:left="720" w:hanging="360"/>
+      </w:pPr>
+      <w:rPr>
+        <w:rFonts w:ascii="Symbol" w:hAnsi="Symbol" w:hint="default"/>
+        <w:sz w:val="20"/>
+      </w:rPr>
+    </w:lvl>
+    <w:lvl w:ilvl="1" w:tentative="1">
+      <w:start w:val="1"/>
+      <w:numFmt w:val="bullet"/>
+      <w:lvlText w:val="o"/>
+      <w:lvlJc w:val="left"/>
+      <w:pPr>
+        <w:tabs>
+          <w:tab w:val="num" w:pos="1440"/>
+        </w:tabs>
+        <w:ind w:left="1440" w:hanging="360"/>
+      </w:pPr>
+      <w:rPr>
+        <w:rFonts w:ascii="Courier New" w:hAnsi="Courier New" w:hint="default"/>
+        <w:sz w:val="20"/>
+      </w:rPr>
+    </w:lvl>
+    <w:lvl w:ilvl="2" w:tentative="1">
+      <w:start w:val="1"/>
+      <w:numFmt w:val="bullet"/>
+      <w:lvlText w:val=""/>
+      <w:lvlJc w:val="left"/>
+      <w:pPr>
+        <w:tabs>
+          <w:tab w:val="num" w:pos="2160"/>
+        </w:tabs>
+        <w:ind w:left="2160" w:hanging="360"/>
+      </w:pPr>
+      <w:rPr>
+        <w:rFonts w:ascii="Wingdings" w:hAnsi="Wingdings" w:hint="default"/>
+        <w:sz w:val="20"/>
+      </w:rPr>
+    </w:lvl>
+    <w:lvl w:ilvl="3" w:tentative="1">
+      <w:start w:val="1"/>
+      <w:numFmt w:val="bullet"/>
+      <w:lvlText w:val=""/>
+      <w:lvlJc w:val="left"/>
+      <w:pPr>
+        <w:tabs>
+          <w:tab w:val="num" w:pos="2880"/>
+        </w:tabs>
+        <w:ind w:left="2880" w:hanging="360"/>
+      </w:pPr>
+      <w:rPr>
+        <w:rFonts w:ascii="Wingdings" w:hAnsi="Wingdings" w:hint="default"/>
+        <w:sz w:val="20"/>
+      </w:rPr>
+    </w:lvl>
+    <w:lvl w:ilvl="4" w:tentative="1">
+      <w:start w:val="1"/>
+      <w:numFmt w:val="bullet"/>
+      <w:lvlText w:val=""/>
+      <w:lvlJc w:val="left"/>
+      <w:pPr>
+        <w:tabs>
+          <w:tab w:val="num" w:pos="3600"/>
+        </w:tabs>
+        <w:ind w:left="3600" w:hanging="360"/>
+      </w:pPr>
+      <w:rPr>
+        <w:rFonts w:ascii="Wingdings" w:hAnsi="Wingdings" w:hint="default"/>
+        <w:sz w:val="20"/>
+      </w:rPr>
+    </w:lvl>
+    <w:lvl w:ilvl="5" w:tentative="1">
+      <w:start w:val="1"/>
+      <w:numFmt w:val="bullet"/>
+      <w:lvlText w:val=""/>
+      <w:lvlJc w:val="left"/>
+      <w:pPr>
+        <w:tabs>
+          <w:tab w:val="num" w:pos="4320"/>
+        </w:tabs>
+        <w:ind w:left="4320" w:hanging="360"/>
+      </w:pPr>
+      <w:rPr>
+        <w:rFonts w:ascii="Wingdings" w:hAnsi="Wingdings" w:hint="default"/>
+        <w:sz w:val="20"/>
+      </w:rPr>
+    </w:lvl>
+    <w:lvl w:ilvl="6" w:tentative="1">
+      <w:start w:val="1"/>
+      <w:numFmt w:val="bullet"/>
+      <w:lvlText w:val=""/>
+      <w:lvlJc w:val="left"/>
+      <w:pPr>
+        <w:tabs>
+          <w:tab w:val="num" w:pos="5040"/>
+        </w:tabs>
+        <w:ind w:left="5040" w:hanging="360"/>
+      </w:pPr>
+      <w:rPr>
+        <w:rFonts w:ascii="Wingdings" w:hAnsi="Wingdings" w:hint="default"/>
+        <w:sz w:val="20"/>
+      </w:rPr>
+    </w:lvl>
+    <w:lvl w:ilvl="7" w:tentative="1">
+      <w:start w:val="1"/>
+      <w:numFmt w:val="bullet"/>
+      <w:lvlText w:val=""/>
+      <w:lvlJc w:val="left"/>
+      <w:pPr>
+        <w:tabs>
+          <w:tab w:val="num" w:pos="5760"/>
+        </w:tabs>
+        <w:ind w:left="5760" w:hanging="360"/>
+      </w:pPr>
+      <w:rPr>
+        <w:rFonts w:ascii="Wingdings" w:hAnsi="Wingdings" w:hint="default"/>
+        <w:sz w:val="20"/>
+      </w:rPr>
+    </w:lvl>
+    <w:lvl w:ilvl="8" w:tentative="1">
+      <w:start w:val="1"/>
+      <w:numFmt w:val="bullet"/>
+      <w:lvlText w:val=""/>
+      <w:lvlJc w:val="left"/>
+      <w:pPr>
+        <w:tabs>
+          <w:tab w:val="num" w:pos="6480"/>
+        </w:tabs>
+        <w:ind w:left="6480" w:hanging="360"/>
+      </w:pPr>
+      <w:rPr>
+        <w:rFonts w:ascii="Wingdings" w:hAnsi="Wingdings" w:hint="default"/>
+        <w:sz w:val="20"/>
+      </w:rPr>
+    </w:lvl>
+  </w:abstractNum>
+  <w:abstractNum w:abstractNumId="10" w15:restartNumberingAfterBreak="0">
+    <w:nsid w:val="2FD4247D"/>
+    <w:multiLevelType w:val="multilevel"/>
+    <w:tmpl w:val="F7DA2EC4"/>
+    <w:lvl w:ilvl="0">
+      <w:start w:val="1"/>
+      <w:numFmt w:val="bullet"/>
+      <w:lvlText w:val=""/>
+      <w:lvlJc w:val="left"/>
+      <w:pPr>
+        <w:tabs>
+          <w:tab w:val="num" w:pos="720"/>
+        </w:tabs>
+        <w:ind w:left="720" w:hanging="360"/>
+      </w:pPr>
+      <w:rPr>
+        <w:rFonts w:ascii="Symbol" w:hAnsi="Symbol" w:hint="default"/>
+        <w:sz w:val="20"/>
+      </w:rPr>
+    </w:lvl>
+    <w:lvl w:ilvl="1" w:tentative="1">
+      <w:start w:val="1"/>
+      <w:numFmt w:val="bullet"/>
+      <w:lvlText w:val="o"/>
+      <w:lvlJc w:val="left"/>
+      <w:pPr>
+        <w:tabs>
+          <w:tab w:val="num" w:pos="1440"/>
+        </w:tabs>
+        <w:ind w:left="1440" w:hanging="360"/>
+      </w:pPr>
+      <w:rPr>
+        <w:rFonts w:ascii="Courier New" w:hAnsi="Courier New" w:hint="default"/>
+        <w:sz w:val="20"/>
+      </w:rPr>
+    </w:lvl>
+    <w:lvl w:ilvl="2" w:tentative="1">
+      <w:start w:val="1"/>
+      <w:numFmt w:val="bullet"/>
+      <w:lvlText w:val=""/>
+      <w:lvlJc w:val="left"/>
+      <w:pPr>
+        <w:tabs>
+          <w:tab w:val="num" w:pos="2160"/>
+        </w:tabs>
+        <w:ind w:left="2160" w:hanging="360"/>
+      </w:pPr>
+      <w:rPr>
+        <w:rFonts w:ascii="Wingdings" w:hAnsi="Wingdings" w:hint="default"/>
+        <w:sz w:val="20"/>
+      </w:rPr>
+    </w:lvl>
+    <w:lvl w:ilvl="3" w:tentative="1">
+      <w:start w:val="1"/>
+      <w:numFmt w:val="bullet"/>
+      <w:lvlText w:val=""/>
+      <w:lvlJc w:val="left"/>
+      <w:pPr>
+        <w:tabs>
+          <w:tab w:val="num" w:pos="2880"/>
+        </w:tabs>
+        <w:ind w:left="2880" w:hanging="360"/>
+      </w:pPr>
+      <w:rPr>
+        <w:rFonts w:ascii="Wingdings" w:hAnsi="Wingdings" w:hint="default"/>
+        <w:sz w:val="20"/>
+      </w:rPr>
+    </w:lvl>
+    <w:lvl w:ilvl="4" w:tentative="1">
+      <w:start w:val="1"/>
+      <w:numFmt w:val="bullet"/>
+      <w:lvlText w:val=""/>
+      <w:lvlJc w:val="left"/>
+      <w:pPr>
+        <w:tabs>
+          <w:tab w:val="num" w:pos="3600"/>
+        </w:tabs>
+        <w:ind w:left="3600" w:hanging="360"/>
+      </w:pPr>
+      <w:rPr>
+        <w:rFonts w:ascii="Wingdings" w:hAnsi="Wingdings" w:hint="default"/>
+        <w:sz w:val="20"/>
+      </w:rPr>
+    </w:lvl>
+    <w:lvl w:ilvl="5" w:tentative="1">
+      <w:start w:val="1"/>
+      <w:numFmt w:val="bullet"/>
+      <w:lvlText w:val=""/>
+      <w:lvlJc w:val="left"/>
+      <w:pPr>
+        <w:tabs>
+          <w:tab w:val="num" w:pos="4320"/>
+        </w:tabs>
+        <w:ind w:left="4320" w:hanging="360"/>
+      </w:pPr>
+      <w:rPr>
+        <w:rFonts w:ascii="Wingdings" w:hAnsi="Wingdings" w:hint="default"/>
+        <w:sz w:val="20"/>
+      </w:rPr>
+    </w:lvl>
+    <w:lvl w:ilvl="6" w:tentative="1">
+      <w:start w:val="1"/>
+      <w:numFmt w:val="bullet"/>
+      <w:lvlText w:val=""/>
+      <w:lvlJc w:val="left"/>
+      <w:pPr>
+        <w:tabs>
+          <w:tab w:val="num" w:pos="5040"/>
+        </w:tabs>
+        <w:ind w:left="5040" w:hanging="360"/>
+      </w:pPr>
+      <w:rPr>
+        <w:rFonts w:ascii="Wingdings" w:hAnsi="Wingdings" w:hint="default"/>
+        <w:sz w:val="20"/>
+      </w:rPr>
+    </w:lvl>
+    <w:lvl w:ilvl="7" w:tentative="1">
+      <w:start w:val="1"/>
+      <w:numFmt w:val="bullet"/>
+      <w:lvlText w:val=""/>
+      <w:lvlJc w:val="left"/>
+      <w:pPr>
+        <w:tabs>
+          <w:tab w:val="num" w:pos="5760"/>
+        </w:tabs>
+        <w:ind w:left="5760" w:hanging="360"/>
+      </w:pPr>
+      <w:rPr>
+        <w:rFonts w:ascii="Wingdings" w:hAnsi="Wingdings" w:hint="default"/>
+        <w:sz w:val="20"/>
+      </w:rPr>
+    </w:lvl>
+    <w:lvl w:ilvl="8" w:tentative="1">
+      <w:start w:val="1"/>
+      <w:numFmt w:val="bullet"/>
+      <w:lvlText w:val=""/>
+      <w:lvlJc w:val="left"/>
+      <w:pPr>
+        <w:tabs>
+          <w:tab w:val="num" w:pos="6480"/>
+        </w:tabs>
+        <w:ind w:left="6480" w:hanging="360"/>
+      </w:pPr>
+      <w:rPr>
+        <w:rFonts w:ascii="Wingdings" w:hAnsi="Wingdings" w:hint="default"/>
+        <w:sz w:val="20"/>
+      </w:rPr>
+    </w:lvl>
+  </w:abstractNum>
+  <w:abstractNum w:abstractNumId="11" w15:restartNumberingAfterBreak="0">
     <w:nsid w:val="3D68736A"/>
     <w:multiLevelType w:val="multilevel"/>
     <w:tmpl w:val="F6966382"/>
@@ -1562,7 +2444,7 @@
       </w:rPr>
     </w:lvl>
   </w:abstractNum>
-  <w:abstractNum w:abstractNumId="5" w15:restartNumberingAfterBreak="0">
+  <w:abstractNum w:abstractNumId="12" w15:restartNumberingAfterBreak="0">
     <w:nsid w:val="3F6556A0"/>
     <w:multiLevelType w:val="multilevel"/>
     <w:tmpl w:val="1506FFEC"/>
@@ -1711,7 +2593,7 @@
       </w:rPr>
     </w:lvl>
   </w:abstractNum>
-  <w:abstractNum w:abstractNumId="6" w15:restartNumberingAfterBreak="0">
+  <w:abstractNum w:abstractNumId="13" w15:restartNumberingAfterBreak="0">
     <w:nsid w:val="4E607E14"/>
     <w:multiLevelType w:val="multilevel"/>
     <w:tmpl w:val="54B288A4"/>
@@ -1860,7 +2742,7 @@
       </w:rPr>
     </w:lvl>
   </w:abstractNum>
-  <w:abstractNum w:abstractNumId="7" w15:restartNumberingAfterBreak="0">
+  <w:abstractNum w:abstractNumId="14" w15:restartNumberingAfterBreak="0">
     <w:nsid w:val="523B73E8"/>
     <w:multiLevelType w:val="multilevel"/>
     <w:tmpl w:val="B34E444E"/>
@@ -2009,7 +2891,7 @@
       </w:rPr>
     </w:lvl>
   </w:abstractNum>
-  <w:abstractNum w:abstractNumId="8" w15:restartNumberingAfterBreak="0">
+  <w:abstractNum w:abstractNumId="15" w15:restartNumberingAfterBreak="0">
     <w:nsid w:val="5241493F"/>
     <w:multiLevelType w:val="multilevel"/>
     <w:tmpl w:val="8C201798"/>
@@ -2158,7 +3040,156 @@
       </w:rPr>
     </w:lvl>
   </w:abstractNum>
-  <w:abstractNum w:abstractNumId="9" w15:restartNumberingAfterBreak="0">
+  <w:abstractNum w:abstractNumId="16" w15:restartNumberingAfterBreak="0">
+    <w:nsid w:val="61DD3379"/>
+    <w:multiLevelType w:val="multilevel"/>
+    <w:tmpl w:val="D0889EB4"/>
+    <w:lvl w:ilvl="0">
+      <w:start w:val="1"/>
+      <w:numFmt w:val="bullet"/>
+      <w:lvlText w:val=""/>
+      <w:lvlJc w:val="left"/>
+      <w:pPr>
+        <w:tabs>
+          <w:tab w:val="num" w:pos="720"/>
+        </w:tabs>
+        <w:ind w:left="720" w:hanging="360"/>
+      </w:pPr>
+      <w:rPr>
+        <w:rFonts w:ascii="Symbol" w:hAnsi="Symbol" w:hint="default"/>
+        <w:sz w:val="20"/>
+      </w:rPr>
+    </w:lvl>
+    <w:lvl w:ilvl="1" w:tentative="1">
+      <w:start w:val="1"/>
+      <w:numFmt w:val="bullet"/>
+      <w:lvlText w:val="o"/>
+      <w:lvlJc w:val="left"/>
+      <w:pPr>
+        <w:tabs>
+          <w:tab w:val="num" w:pos="1440"/>
+        </w:tabs>
+        <w:ind w:left="1440" w:hanging="360"/>
+      </w:pPr>
+      <w:rPr>
+        <w:rFonts w:ascii="Courier New" w:hAnsi="Courier New" w:hint="default"/>
+        <w:sz w:val="20"/>
+      </w:rPr>
+    </w:lvl>
+    <w:lvl w:ilvl="2" w:tentative="1">
+      <w:start w:val="1"/>
+      <w:numFmt w:val="bullet"/>
+      <w:lvlText w:val=""/>
+      <w:lvlJc w:val="left"/>
+      <w:pPr>
+        <w:tabs>
+          <w:tab w:val="num" w:pos="2160"/>
+        </w:tabs>
+        <w:ind w:left="2160" w:hanging="360"/>
+      </w:pPr>
+      <w:rPr>
+        <w:rFonts w:ascii="Wingdings" w:hAnsi="Wingdings" w:hint="default"/>
+        <w:sz w:val="20"/>
+      </w:rPr>
+    </w:lvl>
+    <w:lvl w:ilvl="3" w:tentative="1">
+      <w:start w:val="1"/>
+      <w:numFmt w:val="bullet"/>
+      <w:lvlText w:val=""/>
+      <w:lvlJc w:val="left"/>
+      <w:pPr>
+        <w:tabs>
+          <w:tab w:val="num" w:pos="2880"/>
+        </w:tabs>
+        <w:ind w:left="2880" w:hanging="360"/>
+      </w:pPr>
+      <w:rPr>
+        <w:rFonts w:ascii="Wingdings" w:hAnsi="Wingdings" w:hint="default"/>
+        <w:sz w:val="20"/>
+      </w:rPr>
+    </w:lvl>
+    <w:lvl w:ilvl="4" w:tentative="1">
+      <w:start w:val="1"/>
+      <w:numFmt w:val="bullet"/>
+      <w:lvlText w:val=""/>
+      <w:lvlJc w:val="left"/>
+      <w:pPr>
+        <w:tabs>
+          <w:tab w:val="num" w:pos="3600"/>
+        </w:tabs>
+        <w:ind w:left="3600" w:hanging="360"/>
+      </w:pPr>
+      <w:rPr>
+        <w:rFonts w:ascii="Wingdings" w:hAnsi="Wingdings" w:hint="default"/>
+        <w:sz w:val="20"/>
+      </w:rPr>
+    </w:lvl>
+    <w:lvl w:ilvl="5" w:tentative="1">
+      <w:start w:val="1"/>
+      <w:numFmt w:val="bullet"/>
+      <w:lvlText w:val=""/>
+      <w:lvlJc w:val="left"/>
+      <w:pPr>
+        <w:tabs>
+          <w:tab w:val="num" w:pos="4320"/>
+        </w:tabs>
+        <w:ind w:left="4320" w:hanging="360"/>
+      </w:pPr>
+      <w:rPr>
+        <w:rFonts w:ascii="Wingdings" w:hAnsi="Wingdings" w:hint="default"/>
+        <w:sz w:val="20"/>
+      </w:rPr>
+    </w:lvl>
+    <w:lvl w:ilvl="6" w:tentative="1">
+      <w:start w:val="1"/>
+      <w:numFmt w:val="bullet"/>
+      <w:lvlText w:val=""/>
+      <w:lvlJc w:val="left"/>
+      <w:pPr>
+        <w:tabs>
+          <w:tab w:val="num" w:pos="5040"/>
+        </w:tabs>
+        <w:ind w:left="5040" w:hanging="360"/>
+      </w:pPr>
+      <w:rPr>
+        <w:rFonts w:ascii="Wingdings" w:hAnsi="Wingdings" w:hint="default"/>
+        <w:sz w:val="20"/>
+      </w:rPr>
+    </w:lvl>
+    <w:lvl w:ilvl="7" w:tentative="1">
+      <w:start w:val="1"/>
+      <w:numFmt w:val="bullet"/>
+      <w:lvlText w:val=""/>
+      <w:lvlJc w:val="left"/>
+      <w:pPr>
+        <w:tabs>
+          <w:tab w:val="num" w:pos="5760"/>
+        </w:tabs>
+        <w:ind w:left="5760" w:hanging="360"/>
+      </w:pPr>
+      <w:rPr>
+        <w:rFonts w:ascii="Wingdings" w:hAnsi="Wingdings" w:hint="default"/>
+        <w:sz w:val="20"/>
+      </w:rPr>
+    </w:lvl>
+    <w:lvl w:ilvl="8" w:tentative="1">
+      <w:start w:val="1"/>
+      <w:numFmt w:val="bullet"/>
+      <w:lvlText w:val=""/>
+      <w:lvlJc w:val="left"/>
+      <w:pPr>
+        <w:tabs>
+          <w:tab w:val="num" w:pos="6480"/>
+        </w:tabs>
+        <w:ind w:left="6480" w:hanging="360"/>
+      </w:pPr>
+      <w:rPr>
+        <w:rFonts w:ascii="Wingdings" w:hAnsi="Wingdings" w:hint="default"/>
+        <w:sz w:val="20"/>
+      </w:rPr>
+    </w:lvl>
+  </w:abstractNum>
+  <w:abstractNum w:abstractNumId="17" w15:restartNumberingAfterBreak="0">
     <w:nsid w:val="6A2E2BEC"/>
     <w:multiLevelType w:val="multilevel"/>
     <w:tmpl w:val="72C8CD2E"/>
@@ -2307,35 +3338,363 @@
       </w:rPr>
     </w:lvl>
   </w:abstractNum>
+  <w:abstractNum w:abstractNumId="18" w15:restartNumberingAfterBreak="0">
+    <w:nsid w:val="73665369"/>
+    <w:multiLevelType w:val="multilevel"/>
+    <w:tmpl w:val="7A2C606C"/>
+    <w:lvl w:ilvl="0">
+      <w:start w:val="1"/>
+      <w:numFmt w:val="bullet"/>
+      <w:lvlText w:val=""/>
+      <w:lvlJc w:val="left"/>
+      <w:pPr>
+        <w:tabs>
+          <w:tab w:val="num" w:pos="720"/>
+        </w:tabs>
+        <w:ind w:left="720" w:hanging="360"/>
+      </w:pPr>
+      <w:rPr>
+        <w:rFonts w:ascii="Symbol" w:hAnsi="Symbol" w:hint="default"/>
+        <w:sz w:val="20"/>
+      </w:rPr>
+    </w:lvl>
+    <w:lvl w:ilvl="1" w:tentative="1">
+      <w:start w:val="1"/>
+      <w:numFmt w:val="bullet"/>
+      <w:lvlText w:val="o"/>
+      <w:lvlJc w:val="left"/>
+      <w:pPr>
+        <w:tabs>
+          <w:tab w:val="num" w:pos="1440"/>
+        </w:tabs>
+        <w:ind w:left="1440" w:hanging="360"/>
+      </w:pPr>
+      <w:rPr>
+        <w:rFonts w:ascii="Courier New" w:hAnsi="Courier New" w:hint="default"/>
+        <w:sz w:val="20"/>
+      </w:rPr>
+    </w:lvl>
+    <w:lvl w:ilvl="2" w:tentative="1">
+      <w:start w:val="1"/>
+      <w:numFmt w:val="bullet"/>
+      <w:lvlText w:val=""/>
+      <w:lvlJc w:val="left"/>
+      <w:pPr>
+        <w:tabs>
+          <w:tab w:val="num" w:pos="2160"/>
+        </w:tabs>
+        <w:ind w:left="2160" w:hanging="360"/>
+      </w:pPr>
+      <w:rPr>
+        <w:rFonts w:ascii="Wingdings" w:hAnsi="Wingdings" w:hint="default"/>
+        <w:sz w:val="20"/>
+      </w:rPr>
+    </w:lvl>
+    <w:lvl w:ilvl="3" w:tentative="1">
+      <w:start w:val="1"/>
+      <w:numFmt w:val="bullet"/>
+      <w:lvlText w:val=""/>
+      <w:lvlJc w:val="left"/>
+      <w:pPr>
+        <w:tabs>
+          <w:tab w:val="num" w:pos="2880"/>
+        </w:tabs>
+        <w:ind w:left="2880" w:hanging="360"/>
+      </w:pPr>
+      <w:rPr>
+        <w:rFonts w:ascii="Wingdings" w:hAnsi="Wingdings" w:hint="default"/>
+        <w:sz w:val="20"/>
+      </w:rPr>
+    </w:lvl>
+    <w:lvl w:ilvl="4" w:tentative="1">
+      <w:start w:val="1"/>
+      <w:numFmt w:val="bullet"/>
+      <w:lvlText w:val=""/>
+      <w:lvlJc w:val="left"/>
+      <w:pPr>
+        <w:tabs>
+          <w:tab w:val="num" w:pos="3600"/>
+        </w:tabs>
+        <w:ind w:left="3600" w:hanging="360"/>
+      </w:pPr>
+      <w:rPr>
+        <w:rFonts w:ascii="Wingdings" w:hAnsi="Wingdings" w:hint="default"/>
+        <w:sz w:val="20"/>
+      </w:rPr>
+    </w:lvl>
+    <w:lvl w:ilvl="5" w:tentative="1">
+      <w:start w:val="1"/>
+      <w:numFmt w:val="bullet"/>
+      <w:lvlText w:val=""/>
+      <w:lvlJc w:val="left"/>
+      <w:pPr>
+        <w:tabs>
+          <w:tab w:val="num" w:pos="4320"/>
+        </w:tabs>
+        <w:ind w:left="4320" w:hanging="360"/>
+      </w:pPr>
+      <w:rPr>
+        <w:rFonts w:ascii="Wingdings" w:hAnsi="Wingdings" w:hint="default"/>
+        <w:sz w:val="20"/>
+      </w:rPr>
+    </w:lvl>
+    <w:lvl w:ilvl="6" w:tentative="1">
+      <w:start w:val="1"/>
+      <w:numFmt w:val="bullet"/>
+      <w:lvlText w:val=""/>
+      <w:lvlJc w:val="left"/>
+      <w:pPr>
+        <w:tabs>
+          <w:tab w:val="num" w:pos="5040"/>
+        </w:tabs>
+        <w:ind w:left="5040" w:hanging="360"/>
+      </w:pPr>
+      <w:rPr>
+        <w:rFonts w:ascii="Wingdings" w:hAnsi="Wingdings" w:hint="default"/>
+        <w:sz w:val="20"/>
+      </w:rPr>
+    </w:lvl>
+    <w:lvl w:ilvl="7" w:tentative="1">
+      <w:start w:val="1"/>
+      <w:numFmt w:val="bullet"/>
+      <w:lvlText w:val=""/>
+      <w:lvlJc w:val="left"/>
+      <w:pPr>
+        <w:tabs>
+          <w:tab w:val="num" w:pos="5760"/>
+        </w:tabs>
+        <w:ind w:left="5760" w:hanging="360"/>
+      </w:pPr>
+      <w:rPr>
+        <w:rFonts w:ascii="Wingdings" w:hAnsi="Wingdings" w:hint="default"/>
+        <w:sz w:val="20"/>
+      </w:rPr>
+    </w:lvl>
+    <w:lvl w:ilvl="8" w:tentative="1">
+      <w:start w:val="1"/>
+      <w:numFmt w:val="bullet"/>
+      <w:lvlText w:val=""/>
+      <w:lvlJc w:val="left"/>
+      <w:pPr>
+        <w:tabs>
+          <w:tab w:val="num" w:pos="6480"/>
+        </w:tabs>
+        <w:ind w:left="6480" w:hanging="360"/>
+      </w:pPr>
+      <w:rPr>
+        <w:rFonts w:ascii="Wingdings" w:hAnsi="Wingdings" w:hint="default"/>
+        <w:sz w:val="20"/>
+      </w:rPr>
+    </w:lvl>
+  </w:abstractNum>
+  <w:abstractNum w:abstractNumId="19" w15:restartNumberingAfterBreak="0">
+    <w:nsid w:val="7DE76A50"/>
+    <w:multiLevelType w:val="multilevel"/>
+    <w:tmpl w:val="BD98F04C"/>
+    <w:lvl w:ilvl="0">
+      <w:start w:val="1"/>
+      <w:numFmt w:val="bullet"/>
+      <w:lvlText w:val=""/>
+      <w:lvlJc w:val="left"/>
+      <w:pPr>
+        <w:tabs>
+          <w:tab w:val="num" w:pos="720"/>
+        </w:tabs>
+        <w:ind w:left="720" w:hanging="360"/>
+      </w:pPr>
+      <w:rPr>
+        <w:rFonts w:ascii="Symbol" w:hAnsi="Symbol" w:hint="default"/>
+        <w:sz w:val="20"/>
+      </w:rPr>
+    </w:lvl>
+    <w:lvl w:ilvl="1" w:tentative="1">
+      <w:start w:val="1"/>
+      <w:numFmt w:val="bullet"/>
+      <w:lvlText w:val="o"/>
+      <w:lvlJc w:val="left"/>
+      <w:pPr>
+        <w:tabs>
+          <w:tab w:val="num" w:pos="1440"/>
+        </w:tabs>
+        <w:ind w:left="1440" w:hanging="360"/>
+      </w:pPr>
+      <w:rPr>
+        <w:rFonts w:ascii="Courier New" w:hAnsi="Courier New" w:hint="default"/>
+        <w:sz w:val="20"/>
+      </w:rPr>
+    </w:lvl>
+    <w:lvl w:ilvl="2" w:tentative="1">
+      <w:start w:val="1"/>
+      <w:numFmt w:val="bullet"/>
+      <w:lvlText w:val=""/>
+      <w:lvlJc w:val="left"/>
+      <w:pPr>
+        <w:tabs>
+          <w:tab w:val="num" w:pos="2160"/>
+        </w:tabs>
+        <w:ind w:left="2160" w:hanging="360"/>
+      </w:pPr>
+      <w:rPr>
+        <w:rFonts w:ascii="Wingdings" w:hAnsi="Wingdings" w:hint="default"/>
+        <w:sz w:val="20"/>
+      </w:rPr>
+    </w:lvl>
+    <w:lvl w:ilvl="3" w:tentative="1">
+      <w:start w:val="1"/>
+      <w:numFmt w:val="bullet"/>
+      <w:lvlText w:val=""/>
+      <w:lvlJc w:val="left"/>
+      <w:pPr>
+        <w:tabs>
+          <w:tab w:val="num" w:pos="2880"/>
+        </w:tabs>
+        <w:ind w:left="2880" w:hanging="360"/>
+      </w:pPr>
+      <w:rPr>
+        <w:rFonts w:ascii="Wingdings" w:hAnsi="Wingdings" w:hint="default"/>
+        <w:sz w:val="20"/>
+      </w:rPr>
+    </w:lvl>
+    <w:lvl w:ilvl="4" w:tentative="1">
+      <w:start w:val="1"/>
+      <w:numFmt w:val="bullet"/>
+      <w:lvlText w:val=""/>
+      <w:lvlJc w:val="left"/>
+      <w:pPr>
+        <w:tabs>
+          <w:tab w:val="num" w:pos="3600"/>
+        </w:tabs>
+        <w:ind w:left="3600" w:hanging="360"/>
+      </w:pPr>
+      <w:rPr>
+        <w:rFonts w:ascii="Wingdings" w:hAnsi="Wingdings" w:hint="default"/>
+        <w:sz w:val="20"/>
+      </w:rPr>
+    </w:lvl>
+    <w:lvl w:ilvl="5" w:tentative="1">
+      <w:start w:val="1"/>
+      <w:numFmt w:val="bullet"/>
+      <w:lvlText w:val=""/>
+      <w:lvlJc w:val="left"/>
+      <w:pPr>
+        <w:tabs>
+          <w:tab w:val="num" w:pos="4320"/>
+        </w:tabs>
+        <w:ind w:left="4320" w:hanging="360"/>
+      </w:pPr>
+      <w:rPr>
+        <w:rFonts w:ascii="Wingdings" w:hAnsi="Wingdings" w:hint="default"/>
+        <w:sz w:val="20"/>
+      </w:rPr>
+    </w:lvl>
+    <w:lvl w:ilvl="6" w:tentative="1">
+      <w:start w:val="1"/>
+      <w:numFmt w:val="bullet"/>
+      <w:lvlText w:val=""/>
+      <w:lvlJc w:val="left"/>
+      <w:pPr>
+        <w:tabs>
+          <w:tab w:val="num" w:pos="5040"/>
+        </w:tabs>
+        <w:ind w:left="5040" w:hanging="360"/>
+      </w:pPr>
+      <w:rPr>
+        <w:rFonts w:ascii="Wingdings" w:hAnsi="Wingdings" w:hint="default"/>
+        <w:sz w:val="20"/>
+      </w:rPr>
+    </w:lvl>
+    <w:lvl w:ilvl="7" w:tentative="1">
+      <w:start w:val="1"/>
+      <w:numFmt w:val="bullet"/>
+      <w:lvlText w:val=""/>
+      <w:lvlJc w:val="left"/>
+      <w:pPr>
+        <w:tabs>
+          <w:tab w:val="num" w:pos="5760"/>
+        </w:tabs>
+        <w:ind w:left="5760" w:hanging="360"/>
+      </w:pPr>
+      <w:rPr>
+        <w:rFonts w:ascii="Wingdings" w:hAnsi="Wingdings" w:hint="default"/>
+        <w:sz w:val="20"/>
+      </w:rPr>
+    </w:lvl>
+    <w:lvl w:ilvl="8" w:tentative="1">
+      <w:start w:val="1"/>
+      <w:numFmt w:val="bullet"/>
+      <w:lvlText w:val=""/>
+      <w:lvlJc w:val="left"/>
+      <w:pPr>
+        <w:tabs>
+          <w:tab w:val="num" w:pos="6480"/>
+        </w:tabs>
+        <w:ind w:left="6480" w:hanging="360"/>
+      </w:pPr>
+      <w:rPr>
+        <w:rFonts w:ascii="Wingdings" w:hAnsi="Wingdings" w:hint="default"/>
+        <w:sz w:val="20"/>
+      </w:rPr>
+    </w:lvl>
+  </w:abstractNum>
   <w:num w:numId="1" w16cid:durableId="79102492">
+    <w:abstractNumId w:val="4"/>
+  </w:num>
+  <w:num w:numId="2" w16cid:durableId="2088186429">
     <w:abstractNumId w:val="3"/>
   </w:num>
-  <w:num w:numId="2" w16cid:durableId="2088186429">
+  <w:num w:numId="3" w16cid:durableId="1463421703">
     <w:abstractNumId w:val="2"/>
   </w:num>
-  <w:num w:numId="3" w16cid:durableId="1463421703">
+  <w:num w:numId="4" w16cid:durableId="1245459307">
+    <w:abstractNumId w:val="13"/>
+  </w:num>
+  <w:num w:numId="5" w16cid:durableId="25107509">
+    <w:abstractNumId w:val="11"/>
+  </w:num>
+  <w:num w:numId="6" w16cid:durableId="998120151">
+    <w:abstractNumId w:val="15"/>
+  </w:num>
+  <w:num w:numId="7" w16cid:durableId="1557550322">
+    <w:abstractNumId w:val="14"/>
+  </w:num>
+  <w:num w:numId="8" w16cid:durableId="1891454438">
     <w:abstractNumId w:val="1"/>
   </w:num>
-  <w:num w:numId="4" w16cid:durableId="1245459307">
+  <w:num w:numId="9" w16cid:durableId="1691685337">
+    <w:abstractNumId w:val="12"/>
+  </w:num>
+  <w:num w:numId="10" w16cid:durableId="103350298">
+    <w:abstractNumId w:val="17"/>
+  </w:num>
+  <w:num w:numId="11" w16cid:durableId="2083983166">
+    <w:abstractNumId w:val="0"/>
+  </w:num>
+  <w:num w:numId="12" w16cid:durableId="994139431">
+    <w:abstractNumId w:val="18"/>
+  </w:num>
+  <w:num w:numId="13" w16cid:durableId="67309956">
+    <w:abstractNumId w:val="16"/>
+  </w:num>
+  <w:num w:numId="14" w16cid:durableId="1206258962">
+    <w:abstractNumId w:val="10"/>
+  </w:num>
+  <w:num w:numId="15" w16cid:durableId="1804882793">
     <w:abstractNumId w:val="6"/>
   </w:num>
-  <w:num w:numId="5" w16cid:durableId="25107509">
-    <w:abstractNumId w:val="4"/>
-  </w:num>
-  <w:num w:numId="6" w16cid:durableId="998120151">
+  <w:num w:numId="16" w16cid:durableId="1442259650">
     <w:abstractNumId w:val="8"/>
   </w:num>
-  <w:num w:numId="7" w16cid:durableId="1557550322">
+  <w:num w:numId="17" w16cid:durableId="112214891">
+    <w:abstractNumId w:val="9"/>
+  </w:num>
+  <w:num w:numId="18" w16cid:durableId="2062630932">
     <w:abstractNumId w:val="7"/>
   </w:num>
-  <w:num w:numId="8" w16cid:durableId="1891454438">
-    <w:abstractNumId w:val="0"/>
+  <w:num w:numId="19" w16cid:durableId="685595974">
+    <w:abstractNumId w:val="19"/>
   </w:num>
-  <w:num w:numId="9" w16cid:durableId="1691685337">
+  <w:num w:numId="20" w16cid:durableId="2104451253">
     <w:abstractNumId w:val="5"/>
-  </w:num>
-  <w:num w:numId="10" w16cid:durableId="103350298">
-    <w:abstractNumId w:val="9"/>
   </w:num>
 </w:numbering>
 </file>
@@ -2943,7 +4302,6 @@
   <w:style w:type="character" w:default="1" w:styleId="DefaultParagraphFont">
     <w:name w:val="Default Paragraph Font"/>
     <w:uiPriority w:val="1"/>
-    <w:semiHidden/>
     <w:unhideWhenUsed/>
   </w:style>
   <w:style w:type="table" w:default="1" w:styleId="TableNormal">

</xml_diff>